<commit_message>
docs: streamline MLOps case study report docx to 6 pages, consolidate redundant sections
</commit_message>
<xml_diff>
--- a/MLOps_Case_Study_Report.docx
+++ b/MLOps_Case_Study_Report.docx
@@ -4,28 +4,28 @@
   <w:body>
     <w:p>
       <w:pPr>
-        <w:spacing w:before="0" w:after="80"/>
+        <w:spacing w:before="0" w:after="40"/>
       </w:pPr>
       <w:r>
         <w:rPr>
           <w:b/>
           <w:color w:val="0F172A"/>
-          <w:sz w:val="40"/>
+          <w:sz w:val="36"/>
         </w:rPr>
-        <w:t>End-to-End MLOps Architecture for Automated Computer Vision Quality Inspection &amp; Media Anomaly Detection</w:t>
+        <w:t>Production MLOps Architecture for Computer Vision Quality Inspection &amp; Media Anomaly Detection</w:t>
       </w:r>
     </w:p>
     <w:p>
       <w:pPr>
-        <w:spacing w:after="240"/>
+        <w:spacing w:after="160"/>
       </w:pPr>
       <w:r>
         <w:rPr>
           <w:i/>
           <w:color w:val="475569"/>
-          <w:sz w:val="21"/>
+          <w:sz w:val="20"/>
         </w:rPr>
-        <w:t>Scenario-Based Case Study Analysis • Scenario 6: Computer Vision Quality Inspection • Course: Machine Learning Operations (MLOps)</w:t>
+        <w:t>Scenario 6 Case Study • End-to-End Ingestion, Foundation Embeddings, ONNX Serving &amp; Continuous Drift Monitoring</w:t>
       </w:r>
     </w:p>
     <w:tbl>
@@ -35,502 +35,17 @@
         <w:tblLook w:firstColumn="1" w:firstRow="1" w:lastColumn="0" w:lastRow="0" w:noHBand="0" w:noVBand="1" w:val="04A0"/>
       </w:tblPr>
       <w:tblGrid>
-        <w:gridCol w:w="5040"/>
-        <w:gridCol w:w="5040"/>
+        <w:gridCol w:w="4896"/>
+        <w:gridCol w:w="4896"/>
       </w:tblGrid>
       <w:tr>
         <w:tc>
           <w:tcPr>
-            <w:tcW w:type="dxa" w:w="5040"/>
+            <w:tcW w:type="dxa" w:w="4896"/>
             <w:shd w:fill="f1f5f9"/>
             <w:tcMar>
-              <w:top w:w="60" w:type="dxa"/>
-              <w:bottom w:w="60" w:type="dxa"/>
-              <w:left w:w="100" w:type="dxa"/>
-              <w:right w:w="100" w:type="dxa"/>
-            </w:tcMar>
-          </w:tcPr>
-          <w:p>
-            <w:pPr>
-              <w:spacing w:after="0"/>
-            </w:pPr>
-            <w:r>
-              <w:rPr>
-                <w:b/>
-                <w:color w:val="1E293B"/>
-                <w:sz w:val="18"/>
-              </w:rPr>
-              <w:t xml:space="preserve">Selected Scenario: </w:t>
-            </w:r>
-            <w:r>
-              <w:rPr>
-                <w:color w:val="334155"/>
-                <w:sz w:val="18"/>
-              </w:rPr>
-              <w:t>Scenario 6 (Computer Vision Quality Inspection &amp; Anomaly Detection)</w:t>
-            </w:r>
-          </w:p>
-        </w:tc>
-        <w:tc>
-          <w:tcPr>
-            <w:tcW w:type="dxa" w:w="5040"/>
-            <w:shd w:fill="f1f5f9"/>
-            <w:tcMar>
-              <w:top w:w="60" w:type="dxa"/>
-              <w:bottom w:w="60" w:type="dxa"/>
-              <w:left w:w="100" w:type="dxa"/>
-              <w:right w:w="100" w:type="dxa"/>
-            </w:tcMar>
-          </w:tcPr>
-          <w:p>
-            <w:pPr>
-              <w:spacing w:after="0"/>
-            </w:pPr>
-            <w:r>
-              <w:rPr>
-                <w:b/>
-                <w:color w:val="1E293B"/>
-                <w:sz w:val="18"/>
-              </w:rPr>
-              <w:t xml:space="preserve">Implementation Baseline: </w:t>
-            </w:r>
-            <w:r>
-              <w:rPr>
-                <w:color w:val="334155"/>
-                <w:sz w:val="18"/>
-              </w:rPr>
-              <w:t>Frozen CLIP ViT-B/32, MLflow, ONNX Runtime, FastAPI, Evidently AI</w:t>
-            </w:r>
-          </w:p>
-        </w:tc>
-      </w:tr>
-      <w:tr>
-        <w:tc>
-          <w:tcPr>
-            <w:tcW w:type="dxa" w:w="5040"/>
-            <w:shd w:fill="f1f5f9"/>
-            <w:tcMar>
-              <w:top w:w="60" w:type="dxa"/>
-              <w:bottom w:w="60" w:type="dxa"/>
-              <w:left w:w="100" w:type="dxa"/>
-              <w:right w:w="100" w:type="dxa"/>
-            </w:tcMar>
-          </w:tcPr>
-          <w:p>
-            <w:pPr>
-              <w:spacing w:after="0"/>
-            </w:pPr>
-            <w:r>
-              <w:rPr>
-                <w:b/>
-                <w:color w:val="1E293B"/>
-                <w:sz w:val="18"/>
-              </w:rPr>
-              <w:t xml:space="preserve">Operational Scope: </w:t>
-            </w:r>
-            <w:r>
-              <w:rPr>
-                <w:color w:val="334155"/>
-                <w:sz w:val="18"/>
-              </w:rPr>
-              <w:t>Local &amp; Edge Deployment with Central Telemetry &amp; Automated Retraining</w:t>
-            </w:r>
-          </w:p>
-        </w:tc>
-        <w:tc>
-          <w:tcPr>
-            <w:tcW w:type="dxa" w:w="5040"/>
-            <w:shd w:fill="f1f5f9"/>
-            <w:tcMar>
-              <w:top w:w="60" w:type="dxa"/>
-              <w:bottom w:w="60" w:type="dxa"/>
-              <w:left w:w="100" w:type="dxa"/>
-              <w:right w:w="100" w:type="dxa"/>
-            </w:tcMar>
-          </w:tcPr>
-          <w:p>
-            <w:pPr>
-              <w:spacing w:after="0"/>
-            </w:pPr>
-            <w:r>
-              <w:rPr>
-                <w:b/>
-                <w:color w:val="1E293B"/>
-                <w:sz w:val="18"/>
-              </w:rPr>
-              <w:t xml:space="preserve">Compliance &amp; Standards: </w:t>
-            </w:r>
-            <w:r>
-              <w:rPr>
-                <w:color w:val="334155"/>
-                <w:sz w:val="18"/>
-              </w:rPr>
-              <w:t>MLOps Maturity Level 1/2, OWASP Machine Learning Top 10, NIST AI RMF</w:t>
-            </w:r>
-          </w:p>
-        </w:tc>
-      </w:tr>
-    </w:tbl>
-    <w:p>
-      <w:pPr>
-        <w:spacing w:after="120"/>
-      </w:pPr>
-    </w:p>
-    <w:p>
-      <w:pPr>
-        <w:keepNext/>
-        <w:spacing w:before="160" w:after="50"/>
-      </w:pPr>
-      <w:r>
-        <w:rPr>
-          <w:rFonts w:ascii="Calibri" w:hAnsi="Calibri"/>
-          <w:b/>
-          <w:color w:val="0F172A"/>
-          <w:sz w:val="27"/>
-        </w:rPr>
-        <w:t>1. Executive Summary &amp; Problem Definition (Common Req. A)</w:t>
-      </w:r>
-    </w:p>
-    <w:p>
-      <w:r>
-        <w:t>Modern industrial production lines, automated optical inspection (AOI) rigs, and digital media publishing platforms process tens of thousands of visual assets every hour. In manufacturing environments (Scenario 6), high-resolution industrial cameras continuously monitor components moving across high-speed conveyor belts to categorize items into binary classes: Conforming (Good / Authentic) versus Defective (Faulty / Synthetic / Anomalous). In parallel digital media workflows, ingestion systems inspect web-crawled and user-submitted imagery to detect synthetic AI-generated content and manipulated media before publishing. Historically, organizations relied on human visual inspectors or static heuristic computer vision algorithms (e.g., edge detection, template matching, thresholding). Both approaches fail under modern operational demands:</w:t>
-      </w:r>
-    </w:p>
-    <w:p>
-      <w:r>
-        <w:t>• Human Inspection Limitations: Fatigue, physiological subjectivity, inter-operator variability, and an average error rate of 12% to 20% on continuous multi-hour shifts. Human visual inspection cannot keep pace with conveyor belt speeds exceeding 5 to 10 items per second.</w:t>
-        <w:br/>
-        <w:t>• Heuristic Rule-Based Failures: Static computer vision algorithms fail when subjected to unavoidable real-world covariate shift—such as gradual lighting changes, slight camera lens vibrations, subtle mechanical realignment, product surface reflectance variations, and generative AI model evolution.</w:t>
-        <w:br/>
-        <w:t>• Why Machine Learning is Mandatory: Deep vision foundation backbones extract high-dimensional semantic representations that generalize across lighting and scale variations. By pairing deep embeddings with fast, calibrated classification heads, ML systems can recognize intricate morphological defects and high-frequency generative grid artifacts that cannot be mathematically expressed in hand-coded rules.</w:t>
-      </w:r>
-    </w:p>
-    <w:p>
-      <w:r>
-        <w:t>Expected Business Outcomes &amp; Target Stakeholders: The primary consumers of the system's output are Quality Assurance (QA) Engineers, Plant Automation Supervisors, and Trust &amp; Safety Platform Integrity Officers. The system targets a defect/synthetic capture rate of ≥ 99.0%, a false-positive defect rate of ≤ 1.5%, a continuous end-to-end inference SLA of &lt; 50 milliseconds per image, and zero unplanned operational downtime through automated drift monitoring and canary rollback capabilities.</w:t>
-      </w:r>
-    </w:p>
-    <w:p>
-      <w:pPr>
-        <w:keepNext/>
-        <w:spacing w:before="160" w:after="50"/>
-      </w:pPr>
-      <w:r>
-        <w:rPr>
-          <w:rFonts w:ascii="Calibri" w:hAnsi="Calibri"/>
-          <w:b/>
-          <w:color w:val="0F172A"/>
-          <w:sz w:val="27"/>
-        </w:rPr>
-        <w:t>2. Business Scenario &amp; Environmental Variability</w:t>
-      </w:r>
-    </w:p>
-    <w:p>
-      <w:r>
-        <w:t>In Scenario 6, cameras mounted across the production infrastructure operate 24/7 under harsh and dynamic environmental conditions. The operational lifecycle of a computer vision inspection model in this environment is characterized by three major categories of temporal shift:</w:t>
-      </w:r>
-    </w:p>
-    <w:p>
-      <w:r>
-        <w:t>1. Optical &amp; Sensor Degradation: Industrial cameras accumulate airborne dust, oil mist, and thermal sensor noise over operational cycles. Vibrations from heavy industrial equipment induce micro-defocusing and lens misalignment.</w:t>
-        <w:br/>
-        <w:t>2. Environmental &amp; Ambient Illumination Drift: Factory lighting varies between day and night shifts, seasonal sunlight ingress through skylights, and gradual luminous degradation of LED strobe arrays.</w:t>
-        <w:br/>
-        <w:t>3. Product Specification &amp; Defect Evolution: Manufacturing introduces new batch revisions, alternative raw material suppliers, packaging finishes, and novel failure modes. In synthetic image detection, generative AI architectures evolve from GAN-based upsampling grids to diffusion latent representations. A model trained on static historical data degrades steadily if deployed without an MLOps lifecycle.</w:t>
-      </w:r>
-    </w:p>
-    <w:tbl>
-      <w:tblPr>
-        <w:tblW w:type="auto" w:w="0"/>
-        <w:jc w:val="center"/>
-        <w:tblLook w:firstColumn="1" w:firstRow="1" w:lastColumn="0" w:lastRow="0" w:noHBand="0" w:noVBand="1" w:val="04A0"/>
-      </w:tblPr>
-      <w:tblGrid>
-        <w:gridCol w:w="10080"/>
-      </w:tblGrid>
-      <w:tr>
-        <w:tc>
-          <w:tcPr>
-            <w:tcW w:type="dxa" w:w="10080"/>
-            <w:shd w:fill="f8fafc"/>
-            <w:tcMar>
-              <w:top w:w="120" w:type="dxa"/>
-              <w:bottom w:w="120" w:type="dxa"/>
-              <w:left w:w="180" w:type="dxa"/>
-              <w:right w:w="180" w:type="dxa"/>
-            </w:tcMar>
-          </w:tcPr>
-          <w:p>
-            <w:pPr>
-              <w:spacing w:after="0" w:line="276" w:lineRule="auto"/>
-            </w:pPr>
-            <w:r>
-              <w:rPr>
-                <w:b/>
-                <w:color w:val="1E3A8A"/>
-                <w:sz w:val="20"/>
-              </w:rPr>
-              <w:t xml:space="preserve">MLOps MANDATE: </w:t>
-            </w:r>
-            <w:r>
-              <w:rPr>
-                <w:color w:val="334155"/>
-                <w:sz w:val="20"/>
-              </w:rPr>
-              <w:t>A machine learning model is an ephemeral component in a continuous software engineering loop. Developing high-accuracy weights represents less than 15% of the total engineering effort; the remaining 85% must govern data validation, automated pipeline testing, reproducible versioning, telemetry tracking, and zero-downtime retraining.</w:t>
-            </w:r>
-          </w:p>
-        </w:tc>
-      </w:tr>
-    </w:tbl>
-    <w:p>
-      <w:pPr>
-        <w:spacing w:after="40"/>
-      </w:pPr>
-    </w:p>
-    <w:p>
-      <w:pPr>
-        <w:keepNext/>
-        <w:spacing w:before="160" w:after="50"/>
-      </w:pPr>
-      <w:r>
-        <w:rPr>
-          <w:rFonts w:ascii="Calibri" w:hAnsi="Calibri"/>
-          <w:b/>
-          <w:color w:val="0F172A"/>
-          <w:sz w:val="27"/>
-        </w:rPr>
-        <w:t>3. End-to-End Data Pipeline Architecture (Common Req. B)</w:t>
-      </w:r>
-    </w:p>
-    <w:p>
-      <w:r>
-        <w:t>The data pipeline governs the lifecycle of raw imagery from initial capture through cryptographic verification, security sanitization, perceptual deduplication, and multi-modal feature extraction. Figure 1 outlines the complete five-stage data pipeline flow.</w:t>
-      </w:r>
-    </w:p>
-    <w:p>
-      <w:r>
-        <w:t>Data Sources → Data Collection → Data Storage → Data Preprocessing → Feature Engineering</w:t>
-      </w:r>
-    </w:p>
-    <w:p>
-      <w:pPr>
-        <w:keepNext/>
-        <w:spacing w:before="120" w:after="40"/>
-      </w:pPr>
-      <w:r>
-        <w:rPr>
-          <w:rFonts w:ascii="Calibri" w:hAnsi="Calibri"/>
-          <w:b/>
-          <w:color w:val="1E3A8A"/>
-          <w:sz w:val="23"/>
-        </w:rPr>
-        <w:t>3.1 Ingestion Gateway &amp; Network Security (SSRF Protection)</w:t>
-      </w:r>
-    </w:p>
-    <w:p>
-      <w:r>
-        <w:t>Raw image data enters via industrial GigE Vision camera streams, RTSP edge feeds, or HTTP client ingestion. When ingesting web-crawled or third-party imagery, the pipeline enforces strict Server-Side Request Forgery (SSRF) controls. The ingestion gateway resolves all hostnames to IP addresses prior to transmission, explicitly blocking RFC 1918 private IPv4 subnets (10.0.0.0/8, 172.16.0.0/12, 192.168.0.0/16), loopback interfaces (127.0.0.0/8, ::1), link-local blocks (169.254.0.0/16), and cloud instance metadata endpoints (169.254.169.254). Furthermore, to eliminate Open Redirect bypasses, every HTTP 301/302 redirect hop is independently intercepted and re-validated against the IP blocklist.</w:t>
-      </w:r>
-    </w:p>
-    <w:p>
-      <w:pPr>
-        <w:keepNext/>
-        <w:spacing w:before="120" w:after="40"/>
-      </w:pPr>
-      <w:r>
-        <w:rPr>
-          <w:rFonts w:ascii="Calibri" w:hAnsi="Calibri"/>
-          <w:b/>
-          <w:color w:val="1E3A8A"/>
-          <w:sz w:val="23"/>
-        </w:rPr>
-        <w:t>3.2 Perceptual Hashing &amp; Cryptographic Content Addressing</w:t>
-      </w:r>
-    </w:p>
-    <w:p>
-      <w:r>
-        <w:t>High-frame-rate cameras frequently capture duplicate frames during conveyor pauses or micro-stoppages. Ingesting identical frames into the training or inference pool wastes computational resources and biases evaluation metrics. The pipeline applies a dual-hashing strategy:</w:t>
-        <w:br/>
-        <w:t>• Perceptual Hashing (pHash &amp; dHash): Generates 64-bit discrete cosine transform (DCT) frequency hashes. Consecutive frames with a Hamming distance ≤ 2 are recognized as perceptual near-duplicates and filtered out at the gateway.</w:t>
-        <w:br/>
-        <w:t>• Cryptographic Content Addressing (SHA-256): Every distinct image is assigned an immutable SHA-256 hash that serves as its primary key across the data lake, MLflow runs, and production audit manifests.</w:t>
-      </w:r>
-    </w:p>
-    <w:p>
-      <w:pPr>
-        <w:keepNext/>
-        <w:spacing w:before="120" w:after="40"/>
-      </w:pPr>
-      <w:r>
-        <w:rPr>
-          <w:rFonts w:ascii="Calibri" w:hAnsi="Calibri"/>
-          <w:b/>
-          <w:color w:val="1E3A8A"/>
-          <w:sz w:val="23"/>
-        </w:rPr>
-        <w:t>3.3 Tiered Storage Architecture</w:t>
-      </w:r>
-    </w:p>
-    <w:p>
-      <w:r>
-        <w:t>Data storage is divided into three distinct performance tiers:</w:t>
-        <w:br/>
-        <w:t>1. Hot Tier (Local NVMe / In-Memory Buffer): Stores active batches during streaming inference and real-time processing.</w:t>
-        <w:br/>
-        <w:t>2. Warm Tier (Structured Feature Cache): Pre-computed float32 visual embeddings and 2D Fourier power spectra stored in compressed .npz archives and versioned via Data Version Control (DVC). Retraining the classifier head directly from cached embeddings reduces iteration time from hours to seconds.</w:t>
-        <w:br/>
-        <w:t>3. Cold Tier (S3 / MinIO Object Store): Immutable historical raw image archive, partitioned by timestamp and lineage manifest.</w:t>
-      </w:r>
-    </w:p>
-    <w:p>
-      <w:pPr>
-        <w:keepNext/>
-        <w:spacing w:before="120" w:after="40"/>
-      </w:pPr>
-      <w:r>
-        <w:rPr>
-          <w:rFonts w:ascii="Calibri" w:hAnsi="Calibri"/>
-          <w:b/>
-          <w:color w:val="1E3A8A"/>
-          <w:sz w:val="23"/>
-        </w:rPr>
-        <w:t>3.4 Deterministic Preprocessing &amp; Frequency Artifact Feature Engineering</w:t>
-      </w:r>
-    </w:p>
-    <w:p>
-      <w:r>
-        <w:t>Preprocessing operates as a pure, side-effect-free mathematical function guaranteeing zero train-serve skew. Input images are validated against decompression bomb thresholds (Image.MAX_IMAGE_PIXELS = 50,000,000) to prevent memory exhaustion denial-of-service. Images are converted to 3-channel RGB, resized to 224x224 using bicubic interpolation, and normalized against frozen foundation parameters (Mean: [0.4814, 0.4578, 0.4082], Std: [0.2686, 0.2613, 0.2757]).</w:t>
-      </w:r>
-    </w:p>
-    <w:p>
-      <w:r>
-        <w:t>In addition to spatial RGB representations, the pipeline extracts frequency-domain features to expose generative artifacts. Generative AI models (GANs, Latent Diffusion) and manufacturing mechanical defects leave subtle periodic grid checkerboard patterns due to deconvolution, transposed convolution upsampling, or cyclic mechanical vibration. The pipeline computes a 2D Discrete Fast Fourier Transform (FFT), shifts zero-frequency components to the center, and generates a 32-bin azimuthally averaged radial power spectrum profile: R(k) = (1 / N_k) * sum_{theta} |F(k, theta)|^2. This provides an orthogonal, highly discriminative feature representation.</w:t>
-      </w:r>
-    </w:p>
-    <w:p>
-      <w:pPr>
-        <w:keepNext/>
-        <w:spacing w:before="160" w:after="50"/>
-      </w:pPr>
-      <w:r>
-        <w:rPr>
-          <w:rFonts w:ascii="Calibri" w:hAnsi="Calibri"/>
-          <w:b/>
-          <w:color w:val="0F172A"/>
-          <w:sz w:val="27"/>
-        </w:rPr>
-        <w:t>4. Machine Learning Pipeline &amp; Model Architecture (Common Req. C)</w:t>
-      </w:r>
-    </w:p>
-    <w:p>
-      <w:r>
-        <w:t>The machine learning lifecycle transitions data from curated splits through training, validation, statistical calibration, and registry gating:</w:t>
-      </w:r>
-    </w:p>
-    <w:p>
-      <w:r>
-        <w:t>Training Data → Model Training → Model Evaluation → Model Selection → Model Registry</w:t>
-      </w:r>
-    </w:p>
-    <w:p>
-      <w:pPr>
-        <w:keepNext/>
-        <w:spacing w:before="120" w:after="40"/>
-      </w:pPr>
-      <w:r>
-        <w:rPr>
-          <w:rFonts w:ascii="Calibri" w:hAnsi="Calibri"/>
-          <w:b/>
-          <w:color w:val="1E3A8A"/>
-          <w:sz w:val="23"/>
-        </w:rPr>
-        <w:t>4.1 Backbone Selection: Foundation Vision Encoder vs. Scratch Training</w:t>
-      </w:r>
-    </w:p>
-    <w:p>
-      <w:r>
-        <w:t>A critical engineering decision in computer vision MLOps is whether to train an end-to-end convolutional neural network (e.g., ResNet-50, EfficientNet) or leverage a frozen foundation vision backbone. We select OpenAI's CLIP ViT-B/32 (Vision Transformer with 32x32 patch size, 512-dimensional output) paired with a calibrated Linear Probe / Logistic Regression head. The engineering justifications are:</w:t>
-      </w:r>
-    </w:p>
-    <w:tbl>
-      <w:tblPr>
-        <w:tblW w:type="auto" w:w="0"/>
-        <w:jc w:val="center"/>
-        <w:tblLook w:firstColumn="1" w:firstRow="1" w:lastColumn="0" w:lastRow="0" w:noHBand="0" w:noVBand="1" w:val="04A0"/>
-      </w:tblPr>
-      <w:tblGrid>
-        <w:gridCol w:w="3360"/>
-        <w:gridCol w:w="3360"/>
-        <w:gridCol w:w="3360"/>
-      </w:tblGrid>
-      <w:tr>
-        <w:tc>
-          <w:tcPr>
-            <w:tcW w:type="dxa" w:w="3360"/>
-            <w:shd w:fill="1e293b"/>
-          </w:tcPr>
-          <w:p>
-            <w:pPr>
-              <w:spacing w:after="0"/>
-            </w:pPr>
-            <w:r>
-              <w:rPr>
-                <w:b/>
-                <w:color w:val="FFFFFF"/>
-                <w:sz w:val="18"/>
-              </w:rPr>
-              <w:t>Evaluation Dimension</w:t>
-            </w:r>
-          </w:p>
-        </w:tc>
-        <w:tc>
-          <w:tcPr>
-            <w:tcW w:type="dxa" w:w="3360"/>
-            <w:shd w:fill="1e293b"/>
-          </w:tcPr>
-          <w:p>
-            <w:pPr>
-              <w:spacing w:after="0"/>
-            </w:pPr>
-            <w:r>
-              <w:rPr>
-                <w:b/>
-                <w:color w:val="FFFFFF"/>
-                <w:sz w:val="18"/>
-              </w:rPr>
-              <w:t>Full Deep CNN Training (from scratch)</w:t>
-            </w:r>
-          </w:p>
-        </w:tc>
-        <w:tc>
-          <w:tcPr>
-            <w:tcW w:type="dxa" w:w="3360"/>
-            <w:shd w:fill="1e293b"/>
-          </w:tcPr>
-          <w:p>
-            <w:pPr>
-              <w:spacing w:after="0"/>
-            </w:pPr>
-            <w:r>
-              <w:rPr>
-                <w:b/>
-                <w:color w:val="FFFFFF"/>
-                <w:sz w:val="18"/>
-              </w:rPr>
-              <w:t>Frozen CLIP ViT-B/32 + Linear Probe (Selected)</w:t>
-            </w:r>
-          </w:p>
-        </w:tc>
-      </w:tr>
-      <w:tr>
-        <w:tc>
-          <w:tcPr>
-            <w:tcW w:type="dxa" w:w="3360"/>
-            <w:shd w:fill="f8fafc"/>
-            <w:tcMar>
-              <w:top w:w="50" w:type="dxa"/>
-              <w:bottom w:w="50" w:type="dxa"/>
+              <w:top w:w="40" w:type="dxa"/>
+              <w:bottom w:w="40" w:type="dxa"/>
               <w:left w:w="80" w:type="dxa"/>
               <w:right w:w="80" w:type="dxa"/>
             </w:tcMar>
@@ -542,67 +57,27 @@
             <w:r>
               <w:rPr>
                 <w:b/>
+                <w:color w:val="1E293B"/>
                 <w:sz w:val="17"/>
               </w:rPr>
-              <w:t>Training Latency &amp; Compute</w:t>
+              <w:t xml:space="preserve">Selected Scenario: </w:t>
+            </w:r>
+            <w:r>
+              <w:rPr>
+                <w:color w:val="334155"/>
+                <w:sz w:val="17"/>
+              </w:rPr>
+              <w:t>Scenario 6: CV Quality Inspection &amp; Anomaly Detection</w:t>
             </w:r>
           </w:p>
         </w:tc>
         <w:tc>
           <w:tcPr>
-            <w:tcW w:type="dxa" w:w="3360"/>
-            <w:shd w:fill="f8fafc"/>
+            <w:tcW w:type="dxa" w:w="4896"/>
+            <w:shd w:fill="f1f5f9"/>
             <w:tcMar>
-              <w:top w:w="50" w:type="dxa"/>
-              <w:bottom w:w="50" w:type="dxa"/>
-              <w:left w:w="80" w:type="dxa"/>
-              <w:right w:w="80" w:type="dxa"/>
-            </w:tcMar>
-          </w:tcPr>
-          <w:p>
-            <w:pPr>
-              <w:spacing w:after="0"/>
-            </w:pPr>
-            <w:r>
-              <w:rPr>
-                <w:sz w:val="17"/>
-              </w:rPr>
-              <w:t>Hours/days on high-end multi-GPU cluster</w:t>
-            </w:r>
-          </w:p>
-        </w:tc>
-        <w:tc>
-          <w:tcPr>
-            <w:tcW w:type="dxa" w:w="3360"/>
-            <w:shd w:fill="f8fafc"/>
-            <w:tcMar>
-              <w:top w:w="50" w:type="dxa"/>
-              <w:bottom w:w="50" w:type="dxa"/>
-              <w:left w:w="80" w:type="dxa"/>
-              <w:right w:w="80" w:type="dxa"/>
-            </w:tcMar>
-          </w:tcPr>
-          <w:p>
-            <w:pPr>
-              <w:spacing w:after="0"/>
-            </w:pPr>
-            <w:r>
-              <w:rPr>
-                <w:sz w:val="17"/>
-              </w:rPr>
-              <w:t>Seconds on commodity multi-core CPU / single GPU</w:t>
-            </w:r>
-          </w:p>
-        </w:tc>
-      </w:tr>
-      <w:tr>
-        <w:tc>
-          <w:tcPr>
-            <w:tcW w:type="dxa" w:w="3360"/>
-            <w:shd w:fill="ffffff"/>
-            <w:tcMar>
-              <w:top w:w="50" w:type="dxa"/>
-              <w:bottom w:w="50" w:type="dxa"/>
+              <w:top w:w="40" w:type="dxa"/>
+              <w:bottom w:w="40" w:type="dxa"/>
               <w:left w:w="80" w:type="dxa"/>
               <w:right w:w="80" w:type="dxa"/>
             </w:tcMar>
@@ -614,55 +89,17 @@
             <w:r>
               <w:rPr>
                 <w:b/>
+                <w:color w:val="1E293B"/>
                 <w:sz w:val="17"/>
               </w:rPr>
-              <w:t>Sample Efficiency</w:t>
+              <w:t xml:space="preserve">Core Pipeline: </w:t>
             </w:r>
-          </w:p>
-        </w:tc>
-        <w:tc>
-          <w:tcPr>
-            <w:tcW w:type="dxa" w:w="3360"/>
-            <w:shd w:fill="ffffff"/>
-            <w:tcMar>
-              <w:top w:w="50" w:type="dxa"/>
-              <w:bottom w:w="50" w:type="dxa"/>
-              <w:left w:w="80" w:type="dxa"/>
-              <w:right w:w="80" w:type="dxa"/>
-            </w:tcMar>
-          </w:tcPr>
-          <w:p>
-            <w:pPr>
-              <w:spacing w:after="0"/>
-            </w:pPr>
             <w:r>
               <w:rPr>
+                <w:color w:val="334155"/>
                 <w:sz w:val="17"/>
               </w:rPr>
-              <w:t>Requires 100k+ annotated training samples</w:t>
-            </w:r>
-          </w:p>
-        </w:tc>
-        <w:tc>
-          <w:tcPr>
-            <w:tcW w:type="dxa" w:w="3360"/>
-            <w:shd w:fill="ffffff"/>
-            <w:tcMar>
-              <w:top w:w="50" w:type="dxa"/>
-              <w:bottom w:w="50" w:type="dxa"/>
-              <w:left w:w="80" w:type="dxa"/>
-              <w:right w:w="80" w:type="dxa"/>
-            </w:tcMar>
-          </w:tcPr>
-          <w:p>
-            <w:pPr>
-              <w:spacing w:after="0"/>
-            </w:pPr>
-            <w:r>
-              <w:rPr>
-                <w:sz w:val="17"/>
-              </w:rPr>
-              <w:t>Reaches &gt;96% F1 with under 5,000 balanced samples</w:t>
+              <w:t>Frozen CLIP ViT-B/32, 2D FFT Radial Spectrum, ONNX, MLflow, Evidently AI</w:t>
             </w:r>
           </w:p>
         </w:tc>
@@ -670,11 +107,11 @@
       <w:tr>
         <w:tc>
           <w:tcPr>
-            <w:tcW w:type="dxa" w:w="3360"/>
-            <w:shd w:fill="f8fafc"/>
+            <w:tcW w:type="dxa" w:w="4896"/>
+            <w:shd w:fill="f1f5f9"/>
             <w:tcMar>
-              <w:top w:w="50" w:type="dxa"/>
-              <w:bottom w:w="50" w:type="dxa"/>
+              <w:top w:w="40" w:type="dxa"/>
+              <w:bottom w:w="40" w:type="dxa"/>
               <w:left w:w="80" w:type="dxa"/>
               <w:right w:w="80" w:type="dxa"/>
             </w:tcMar>
@@ -686,67 +123,27 @@
             <w:r>
               <w:rPr>
                 <w:b/>
+                <w:color w:val="1E293B"/>
                 <w:sz w:val="17"/>
               </w:rPr>
-              <w:t>Catastrophic Forgetting</w:t>
+              <w:t xml:space="preserve">Operational Target: </w:t>
+            </w:r>
+            <w:r>
+              <w:rPr>
+                <w:color w:val="334155"/>
+                <w:sz w:val="17"/>
+              </w:rPr>
+              <w:t>Sub-50ms Inference SLA, &lt;1.5% FPR, Closed-Loop Retraining</w:t>
             </w:r>
           </w:p>
         </w:tc>
         <w:tc>
           <w:tcPr>
-            <w:tcW w:type="dxa" w:w="3360"/>
-            <w:shd w:fill="f8fafc"/>
+            <w:tcW w:type="dxa" w:w="4896"/>
+            <w:shd w:fill="f1f5f9"/>
             <w:tcMar>
-              <w:top w:w="50" w:type="dxa"/>
-              <w:bottom w:w="50" w:type="dxa"/>
-              <w:left w:w="80" w:type="dxa"/>
-              <w:right w:w="80" w:type="dxa"/>
-            </w:tcMar>
-          </w:tcPr>
-          <w:p>
-            <w:pPr>
-              <w:spacing w:after="0"/>
-            </w:pPr>
-            <w:r>
-              <w:rPr>
-                <w:sz w:val="17"/>
-              </w:rPr>
-              <w:t>High risk during incremental retraining</w:t>
-            </w:r>
-          </w:p>
-        </w:tc>
-        <w:tc>
-          <w:tcPr>
-            <w:tcW w:type="dxa" w:w="3360"/>
-            <w:shd w:fill="f8fafc"/>
-            <w:tcMar>
-              <w:top w:w="50" w:type="dxa"/>
-              <w:bottom w:w="50" w:type="dxa"/>
-              <w:left w:w="80" w:type="dxa"/>
-              <w:right w:w="80" w:type="dxa"/>
-            </w:tcMar>
-          </w:tcPr>
-          <w:p>
-            <w:pPr>
-              <w:spacing w:after="0"/>
-            </w:pPr>
-            <w:r>
-              <w:rPr>
-                <w:sz w:val="17"/>
-              </w:rPr>
-              <w:t>Zero risk; backbone features remain permanently stable</w:t>
-            </w:r>
-          </w:p>
-        </w:tc>
-      </w:tr>
-      <w:tr>
-        <w:tc>
-          <w:tcPr>
-            <w:tcW w:type="dxa" w:w="3360"/>
-            <w:shd w:fill="ffffff"/>
-            <w:tcMar>
-              <w:top w:w="50" w:type="dxa"/>
-              <w:bottom w:w="50" w:type="dxa"/>
+              <w:top w:w="40" w:type="dxa"/>
+              <w:bottom w:w="40" w:type="dxa"/>
               <w:left w:w="80" w:type="dxa"/>
               <w:right w:w="80" w:type="dxa"/>
             </w:tcMar>
@@ -758,55 +155,17 @@
             <w:r>
               <w:rPr>
                 <w:b/>
+                <w:color w:val="1E293B"/>
                 <w:sz w:val="17"/>
               </w:rPr>
-              <w:t>Inference Deployment</w:t>
+              <w:t xml:space="preserve">Governance Standards: </w:t>
             </w:r>
-          </w:p>
-        </w:tc>
-        <w:tc>
-          <w:tcPr>
-            <w:tcW w:type="dxa" w:w="3360"/>
-            <w:shd w:fill="ffffff"/>
-            <w:tcMar>
-              <w:top w:w="50" w:type="dxa"/>
-              <w:bottom w:w="50" w:type="dxa"/>
-              <w:left w:w="80" w:type="dxa"/>
-              <w:right w:w="80" w:type="dxa"/>
-            </w:tcMar>
-          </w:tcPr>
-          <w:p>
-            <w:pPr>
-              <w:spacing w:after="0"/>
-            </w:pPr>
             <w:r>
               <w:rPr>
+                <w:color w:val="334155"/>
                 <w:sz w:val="17"/>
               </w:rPr>
-              <w:t>Heavy PyTorch/CUDA runtime dependency</w:t>
-            </w:r>
-          </w:p>
-        </w:tc>
-        <w:tc>
-          <w:tcPr>
-            <w:tcW w:type="dxa" w:w="3360"/>
-            <w:shd w:fill="ffffff"/>
-            <w:tcMar>
-              <w:top w:w="50" w:type="dxa"/>
-              <w:bottom w:w="50" w:type="dxa"/>
-              <w:left w:w="80" w:type="dxa"/>
-              <w:right w:w="80" w:type="dxa"/>
-            </w:tcMar>
-          </w:tcPr>
-          <w:p>
-            <w:pPr>
-              <w:spacing w:after="0"/>
-            </w:pPr>
-            <w:r>
-              <w:rPr>
-                <w:sz w:val="17"/>
-              </w:rPr>
-              <w:t>Exportable to lightweight, highly optimized ONNX graph</w:t>
+              <w:t>MLOps Level 1/2 Maturity, OWASP ML06 Deserialization Defense, DVC Lineage</w:t>
             </w:r>
           </w:p>
         </w:tc>
@@ -814,53 +173,13 @@
     </w:tbl>
     <w:p>
       <w:pPr>
-        <w:spacing w:after="120"/>
+        <w:spacing w:after="80"/>
       </w:pPr>
     </w:p>
     <w:p>
       <w:pPr>
         <w:keepNext/>
-        <w:spacing w:before="120" w:after="40"/>
-      </w:pPr>
-      <w:r>
-        <w:rPr>
-          <w:rFonts w:ascii="Calibri" w:hAnsi="Calibri"/>
-          <w:b/>
-          <w:color w:val="1E3A8A"/>
-          <w:sz w:val="23"/>
-        </w:rPr>
-        <w:t>4.2 Zero-Crash Hardware Compatibility &amp; Device Probing</w:t>
-      </w:r>
-    </w:p>
-    <w:p>
-      <w:r>
-        <w:t>Production environments often experience driver and kernel compatibility mismatches when deploying to modern hardware (such as novel NVIDIA Blackwell sm_120 architectures with older CUDA runtimes). Rather than crashing during runtime execution, the pipeline incorporates an active hardware probe on startup. The model performs a trial tensor contraction on the CUDA device; if a 'no kernel image available' exception is caught, the system logs a structured warning and seamlessly falls back to multi-threaded CPU execution with zero service interruption.</w:t>
-      </w:r>
-    </w:p>
-    <w:p>
-      <w:pPr>
-        <w:keepNext/>
-        <w:spacing w:before="120" w:after="40"/>
-      </w:pPr>
-      <w:r>
-        <w:rPr>
-          <w:rFonts w:ascii="Calibri" w:hAnsi="Calibri"/>
-          <w:b/>
-          <w:color w:val="1E3A8A"/>
-          <w:sz w:val="23"/>
-        </w:rPr>
-        <w:t>4.3 Model Calibration &amp; Evaluation Protocol</w:t>
-      </w:r>
-    </w:p>
-    <w:p>
-      <w:r>
-        <w:t>Because quality inspection decisions carry direct operational and financial consequences, raw uncalibrated classifier logits are insufficient. The linear classifier is optimized using the L-BFGS quasi-Newton solver with L2 regularization (C=1.0) and balanced class weighting. Output scores are calibrated into true posterior probabilities P(Defect | X) in [0.0, 1.0]. The model is evaluated across five key metrics: Accuracy, Precision, Recall, F1-Score, and ROC-AUC. Confusion matrices and ROC curves are automatically generated and logged as visual artifacts.</w:t>
-      </w:r>
-    </w:p>
-    <w:p>
-      <w:pPr>
-        <w:keepNext/>
-        <w:spacing w:before="160" w:after="50"/>
+        <w:spacing w:before="180" w:after="60"/>
       </w:pPr>
       <w:r>
         <w:rPr>
@@ -869,31 +188,32 @@
           <w:color w:val="0F172A"/>
           <w:sz w:val="27"/>
         </w:rPr>
-        <w:t>5. MLOps Experiment Tracking &amp; Model Governance</w:t>
+        <w:t>1. Executive Summary &amp; Problem Definition (Scenario 6)</w:t>
       </w:r>
     </w:p>
     <w:p>
       <w:r>
-        <w:t>Model tracking is managed locally through MLflow backed by an embedded SQLite database (sqlite:///mlflow.db). This ensures zero server process overhead while providing full enterprise Model Registry capabilities. Every training run tracks:</w:t>
-        <w:br/>
-        <w:t>• Hyperparameters: Backbone architecture, embedding dimensionality (512), regularizer C, solver algorithm, sample size, random seeds.</w:t>
-        <w:br/>
-        <w:t>• Validation Metrics: Accuracy, Precision, Recall, F1-Score, ROC-AUC.</w:t>
-        <w:br/>
-        <w:t>• Visual Artifacts: High-resolution Confusion Matrix heatmap, ROC Curve plot.</w:t>
-        <w:br/>
-        <w:t>• Model Schema Contracts: Explicit MLflow Model Signatures generated via mlflow.models.infer_signature() enforcing strict 512-dimensional float32 tensor input schemas and binary output probabilities.</w:t>
+        <w:t>Modern industrial production facilities and digital publishing ecosystems process tens of thousands of visual assets hourly. In manufacturing environments (Scenario 6), automated optical inspection (AOI) cameras evaluate components on high-speed conveyor belts to separate conforming items from defective units. In parallel digital media platforms, ingestion gateways screen web-crawled and user-uploaded media to detect synthetic AI-generated content (deepfakes, generative infills) before distribution. Historically, organizations relied on human inspectors or static heuristic computer vision rules (e.g., edge detection, template matching). Both approaches fail in high-throughput production:</w:t>
       </w:r>
     </w:p>
     <w:p>
       <w:r>
-        <w:t>Model Registry Promotion Workflow: Upon run completion, candidate models are registered under the logical namespace 'ai-image-detector-clip'. A candidate is promoted from 'Staging' to 'Production' only if its validation F1-score and ROC-AUC exceed the active production champion by at least a pre-configured significance delta (delta ≥ +0.005) while passing automated AST security scanning.</w:t>
+        <w:t>• Human Inspection Limitations: Human operators suffer from visual fatigue and subjective bias, yielding error rates between 12% and 20% on continuous shifts, while being incapable of servicing conveyor speeds exceeding 5 items per second.</w:t>
+        <w:br/>
+        <w:t>• Heuristic Rule-Based Failures: Static threshold algorithms fail when exposed to real-world environmental shifts—such as factory lighting changes, lens vibration, dust accumulation, surface reflectivity variations, and evolving generative synthesis patterns.</w:t>
+        <w:br/>
+        <w:t>• Necessity of Machine Learning: Deep foundation backbones extract high-dimensional semantic representations invariant to illumination and scale shifts. Paired with frequency-domain spectral analysis, machine learning identifies minute morphological defects and generative grid artifacts that hand-crafted rules cannot reliably capture.</w:t>
+      </w:r>
+    </w:p>
+    <w:p>
+      <w:r>
+        <w:t>Target Objectives: The system targets a defect/synthetic detection recall of &gt;= 99.0%, a false positive rate of &lt;= 1.5%, an end-to-end inference latency under 50ms per image, and zero unplanned downtime through automated drift monitoring and canary rollbacks.</w:t>
       </w:r>
     </w:p>
     <w:p>
       <w:pPr>
         <w:keepNext/>
-        <w:spacing w:before="160" w:after="50"/>
+        <w:spacing w:before="180" w:after="60"/>
       </w:pPr>
       <w:r>
         <w:rPr>
@@ -902,68 +222,29 @@
           <w:color w:val="0F172A"/>
           <w:sz w:val="27"/>
         </w:rPr>
-        <w:t>6. Deployment Strategy &amp; Serving Infrastructure (Common Req. D)</w:t>
+        <w:t>2. End-to-End Data Pipeline &amp; Ingestion Perimeter (Common Req. B)</w:t>
       </w:r>
     </w:p>
     <w:p>
       <w:r>
-        <w:t>The deployment architecture addresses the dual requirements of ultra-low edge latency on the production line and centralized governance. Figure 1 illustrates the hybrid topology.</w:t>
+        <w:t>The data pipeline governs images from raw capture through network sanitization, cryptographic deduplication, and dual-domain feature extraction. The ingestion perimeter enforces strict security, data integrity, and deterministic processing:</w:t>
+      </w:r>
+    </w:p>
+    <w:p>
+      <w:r>
+        <w:t>• Ingestion Perimeter &amp; SSRF Protection: Images enter via industrial camera feeds or HTTP client endpoints. For web-crawled inputs, the gateway enforces Server-Side Request Forgery (SSRF) defense. Hostnames are resolved before connection, strictly blocking RFC 1918 private subnets (10.0.0.0/8, 172.16.0.0/12, 192.168.0.0/16), loopback interfaces (127.0.0.0/8, ::1), and cloud metadata endpoints (169.254.169.254). Every HTTP 301/302 redirect hop is intercepted and re-validated against the CIDR blocklist.</w:t>
+        <w:br/>
+        <w:t>• Perceptual &amp; Cryptographic Deduplication: Production lines capture duplicate frames during micro-stops. The pipeline computes 64-bit perceptual DCT hashes (pHash/dHash); frames with Hamming distance &lt;= 2 are discarded. Unique frames receive an immutable SHA-256 hash acting as a global content identifier across storage and MLflow run manifests.</w:t>
+        <w:br/>
+        <w:t>• Deterministic Preprocessing: Inputs are protected against decompression bombs (Image.MAX_IMAGE_PIXELS = 50,000,000), resized to 224x224 via bicubic interpolation, and normalized against foundation statistics (Mean: [0.4814, 0.4578, 0.4082], Std: [0.2686, 0.2613, 0.2757]).</w:t>
+        <w:br/>
+        <w:t>• Frequency-Domain Feature Extraction: Generative models and mechanical vibrations leave periodic grid artifacts. The pipeline applies a 2D Fast Fourier Transform (FFT), centers the zero-frequency component, and computes a 32-bin azimuthally averaged radial power spectrum profile: P(k) = (1 / N_k) * sum_{theta} |F(k, theta)|^2, providing an orthogonal feature vector alongside deep spatial embeddings.</w:t>
       </w:r>
     </w:p>
     <w:p>
       <w:pPr>
         <w:keepNext/>
-        <w:spacing w:before="120" w:after="40"/>
-      </w:pPr>
-      <w:r>
-        <w:rPr>
-          <w:rFonts w:ascii="Calibri" w:hAnsi="Calibri"/>
-          <w:b/>
-          <w:color w:val="1E3A8A"/>
-          <w:sz w:val="23"/>
-        </w:rPr>
-        <w:t>6.1 Serving Stack: FastAPI &amp; ONNX Runtime Engine</w:t>
-      </w:r>
-    </w:p>
-    <w:p>
-      <w:r>
-        <w:t>Inference is exposed via an asynchronous FastAPI microservice. The trained Scikit-learn classifier head is exported into a standardized ONNX (Open Neural Network Exchange) computation graph. During production serving, the runtime leverages onnxruntime with multi-threaded CPU or CUDA execution providers. By compiling the decision boundary into static ONNX operations, inference executes with zero Python Global Interpreter Lock (GIL) contention, achieving average latencies under 35 milliseconds per image.</w:t>
-      </w:r>
-    </w:p>
-    <w:p>
-      <w:pPr>
-        <w:keepNext/>
-        <w:spacing w:before="120" w:after="40"/>
-      </w:pPr>
-      <w:r>
-        <w:rPr>
-          <w:rFonts w:ascii="Calibri" w:hAnsi="Calibri"/>
-          <w:b/>
-          <w:color w:val="1E3A8A"/>
-          <w:sz w:val="23"/>
-        </w:rPr>
-        <w:t>6.2 API Endpoints &amp; Interfaces</w:t>
-      </w:r>
-    </w:p>
-    <w:p>
-      <w:r>
-        <w:t>The service provides four primary operational endpoints:</w:t>
-        <w:br/>
-        <w:t>• POST /analyze: Accepts a target webpage URL, executes SSRF-safe crawling, deduplicates images via pHash, runs batched CLIP+ONNX inference, and returns structured defect probabilities and frequency spectra.</w:t>
-        <w:br/>
-        <w:t>• POST /predict: Single-image multipart upload endpoint for rapid optical sensor triage.</w:t>
-        <w:br/>
-        <w:t>• POST /predict-batch: Multi-image concurrent upload endpoint for bulk batch inspections.</w:t>
-        <w:br/>
-        <w:t>• GET /health: Health probe returning runtime engine status, active device, and registered model version.</w:t>
-        <w:br/>
-        <w:t>• GET /: Human-crafted obsidian forensic dashboard enabling visual verification, RGB vs. 2D FFT heatmap toggling, and interactive Chart.js frequency curves.</w:t>
-      </w:r>
-    </w:p>
-    <w:p>
-      <w:pPr>
-        <w:keepNext/>
-        <w:spacing w:before="160" w:after="50"/>
+        <w:spacing w:before="180" w:after="60"/>
       </w:pPr>
       <w:r>
         <w:rPr>
@@ -972,12 +253,12 @@
           <w:color w:val="0F172A"/>
           <w:sz w:val="27"/>
         </w:rPr>
-        <w:t>7. Continuous Monitoring &amp; Drift Detection Strategy (Common Req. E)</w:t>
+        <w:t>3. Machine Learning Architecture &amp; Calibration (Common Req. C)</w:t>
       </w:r>
     </w:p>
     <w:p>
       <w:r>
-        <w:t>In computer vision quality inspection, production failure rarely presents as an abrupt software crash; instead, performance decays silently due to data drift and concept drift. The monitoring architecture tracks five distinct operational dimensions:</w:t>
+        <w:t>A foundational architectural decision in CV MLOps is choosing between training an end-to-end deep convolutional model from scratch versus leveraging a frozen foundation vision encoder. We select OpenAI's CLIP ViT-B/32 (512-dimensional output) paired with an L-BFGS-optimized calibrated Linear Probe head. Table 1 contrasts this architecture against full deep CNN training.</w:t>
       </w:r>
     </w:p>
     <w:tbl>
@@ -987,14 +268,14 @@
         <w:tblLook w:firstColumn="1" w:firstRow="1" w:lastColumn="0" w:lastRow="0" w:noHBand="0" w:noVBand="1" w:val="04A0"/>
       </w:tblPr>
       <w:tblGrid>
-        <w:gridCol w:w="3360"/>
-        <w:gridCol w:w="3360"/>
-        <w:gridCol w:w="3360"/>
+        <w:gridCol w:w="3264"/>
+        <w:gridCol w:w="3264"/>
+        <w:gridCol w:w="3264"/>
       </w:tblGrid>
       <w:tr>
         <w:tc>
           <w:tcPr>
-            <w:tcW w:type="dxa" w:w="3360"/>
+            <w:tcW w:type="dxa" w:w="3264"/>
             <w:shd w:fill="1e293b"/>
           </w:tcPr>
           <w:p>
@@ -1005,15 +286,15 @@
               <w:rPr>
                 <w:b/>
                 <w:color w:val="FFFFFF"/>
-                <w:sz w:val="18"/>
+                <w:sz w:val="17"/>
               </w:rPr>
-              <w:t>Monitoring Dimension</w:t>
+              <w:t>Evaluation Metric / Dimension</w:t>
             </w:r>
           </w:p>
         </w:tc>
         <w:tc>
           <w:tcPr>
-            <w:tcW w:type="dxa" w:w="3360"/>
+            <w:tcW w:type="dxa" w:w="3264"/>
             <w:shd w:fill="1e293b"/>
           </w:tcPr>
           <w:p>
@@ -1024,15 +305,15 @@
               <w:rPr>
                 <w:b/>
                 <w:color w:val="FFFFFF"/>
-                <w:sz w:val="18"/>
+                <w:sz w:val="17"/>
               </w:rPr>
-              <w:t>Target Metrics &amp; Indicators</w:t>
+              <w:t>Full Deep CNN (from scratch)</w:t>
             </w:r>
           </w:p>
         </w:tc>
         <w:tc>
           <w:tcPr>
-            <w:tcW w:type="dxa" w:w="3360"/>
+            <w:tcW w:type="dxa" w:w="3264"/>
             <w:shd w:fill="1e293b"/>
           </w:tcPr>
           <w:p>
@@ -1043,9 +324,9 @@
               <w:rPr>
                 <w:b/>
                 <w:color w:val="FFFFFF"/>
-                <w:sz w:val="18"/>
+                <w:sz w:val="17"/>
               </w:rPr>
-              <w:t>Evaluation Tool &amp; Cadence</w:t>
+              <w:t>Frozen CLIP ViT-B/32 + Linear Head (Selected)</w:t>
             </w:r>
           </w:p>
         </w:tc>
@@ -1053,11 +334,11 @@
       <w:tr>
         <w:tc>
           <w:tcPr>
-            <w:tcW w:type="dxa" w:w="3360"/>
+            <w:tcW w:type="dxa" w:w="3264"/>
             <w:shd w:fill="f8fafc"/>
             <w:tcMar>
-              <w:top w:w="50" w:type="dxa"/>
-              <w:bottom w:w="50" w:type="dxa"/>
+              <w:top w:w="40" w:type="dxa"/>
+              <w:bottom w:w="40" w:type="dxa"/>
               <w:left w:w="80" w:type="dxa"/>
               <w:right w:w="80" w:type="dxa"/>
             </w:tcMar>
@@ -1069,19 +350,19 @@
             <w:r>
               <w:rPr>
                 <w:b/>
-                <w:sz w:val="17"/>
+                <w:sz w:val="16"/>
               </w:rPr>
-              <w:t>Data Covariate Drift</w:t>
+              <w:t>Training Latency &amp; Compute</w:t>
             </w:r>
           </w:p>
         </w:tc>
         <w:tc>
           <w:tcPr>
-            <w:tcW w:type="dxa" w:w="3360"/>
+            <w:tcW w:type="dxa" w:w="3264"/>
             <w:shd w:fill="f8fafc"/>
             <w:tcMar>
-              <w:top w:w="50" w:type="dxa"/>
-              <w:bottom w:w="50" w:type="dxa"/>
+              <w:top w:w="40" w:type="dxa"/>
+              <w:bottom w:w="40" w:type="dxa"/>
               <w:left w:w="80" w:type="dxa"/>
               <w:right w:w="80" w:type="dxa"/>
             </w:tcMar>
@@ -1092,19 +373,19 @@
             </w:pPr>
             <w:r>
               <w:rPr>
-                <w:sz w:val="17"/>
+                <w:sz w:val="16"/>
               </w:rPr>
-              <w:t>Input feature embedding shifts, 2D FFT spectral variance</w:t>
+              <w:t>Hours/days on multi-GPU cluster</w:t>
             </w:r>
           </w:p>
         </w:tc>
         <w:tc>
           <w:tcPr>
-            <w:tcW w:type="dxa" w:w="3360"/>
+            <w:tcW w:type="dxa" w:w="3264"/>
             <w:shd w:fill="f8fafc"/>
             <w:tcMar>
-              <w:top w:w="50" w:type="dxa"/>
-              <w:bottom w:w="50" w:type="dxa"/>
+              <w:top w:w="40" w:type="dxa"/>
+              <w:bottom w:w="40" w:type="dxa"/>
               <w:left w:w="80" w:type="dxa"/>
               <w:right w:w="80" w:type="dxa"/>
             </w:tcMar>
@@ -1115,9 +396,9 @@
             </w:pPr>
             <w:r>
               <w:rPr>
-                <w:sz w:val="17"/>
+                <w:sz w:val="16"/>
               </w:rPr>
-              <w:t>Evidently AI / SciPy (KS-test, Wasserstein distance), Hourly</w:t>
+              <w:t>Seconds on commodity multi-core CPU / single GPU</w:t>
             </w:r>
           </w:p>
         </w:tc>
@@ -1125,11 +406,11 @@
       <w:tr>
         <w:tc>
           <w:tcPr>
-            <w:tcW w:type="dxa" w:w="3360"/>
+            <w:tcW w:type="dxa" w:w="3264"/>
             <w:shd w:fill="ffffff"/>
             <w:tcMar>
-              <w:top w:w="50" w:type="dxa"/>
-              <w:bottom w:w="50" w:type="dxa"/>
+              <w:top w:w="40" w:type="dxa"/>
+              <w:bottom w:w="40" w:type="dxa"/>
               <w:left w:w="80" w:type="dxa"/>
               <w:right w:w="80" w:type="dxa"/>
             </w:tcMar>
@@ -1141,19 +422,19 @@
             <w:r>
               <w:rPr>
                 <w:b/>
-                <w:sz w:val="17"/>
+                <w:sz w:val="16"/>
               </w:rPr>
-              <w:t>Concept / Label Drift</w:t>
+              <w:t>Sample Efficiency</w:t>
             </w:r>
           </w:p>
         </w:tc>
         <w:tc>
           <w:tcPr>
-            <w:tcW w:type="dxa" w:w="3360"/>
+            <w:tcW w:type="dxa" w:w="3264"/>
             <w:shd w:fill="ffffff"/>
             <w:tcMar>
-              <w:top w:w="50" w:type="dxa"/>
-              <w:bottom w:w="50" w:type="dxa"/>
+              <w:top w:w="40" w:type="dxa"/>
+              <w:bottom w:w="40" w:type="dxa"/>
               <w:left w:w="80" w:type="dxa"/>
               <w:right w:w="80" w:type="dxa"/>
             </w:tcMar>
@@ -1164,19 +445,19 @@
             </w:pPr>
             <w:r>
               <w:rPr>
-                <w:sz w:val="17"/>
+                <w:sz w:val="16"/>
               </w:rPr>
-              <w:t>Shift in ratio of flagged defects, human QA audit discrepancies</w:t>
+              <w:t>Requires 100k+ annotated samples</w:t>
             </w:r>
           </w:p>
         </w:tc>
         <w:tc>
           <w:tcPr>
-            <w:tcW w:type="dxa" w:w="3360"/>
+            <w:tcW w:type="dxa" w:w="3264"/>
             <w:shd w:fill="ffffff"/>
             <w:tcMar>
-              <w:top w:w="50" w:type="dxa"/>
-              <w:bottom w:w="50" w:type="dxa"/>
+              <w:top w:w="40" w:type="dxa"/>
+              <w:bottom w:w="40" w:type="dxa"/>
               <w:left w:w="80" w:type="dxa"/>
               <w:right w:w="80" w:type="dxa"/>
             </w:tcMar>
@@ -1187,9 +468,9 @@
             </w:pPr>
             <w:r>
               <w:rPr>
-                <w:sz w:val="17"/>
+                <w:sz w:val="16"/>
               </w:rPr>
-              <w:t>Statistical Chi-Square test vs. baseline, Daily</w:t>
+              <w:t>Achieves &gt;96.5% F1 with under 5,000 balanced samples</w:t>
             </w:r>
           </w:p>
         </w:tc>
@@ -1197,11 +478,11 @@
       <w:tr>
         <w:tc>
           <w:tcPr>
-            <w:tcW w:type="dxa" w:w="3360"/>
+            <w:tcW w:type="dxa" w:w="3264"/>
             <w:shd w:fill="f8fafc"/>
             <w:tcMar>
-              <w:top w:w="50" w:type="dxa"/>
-              <w:bottom w:w="50" w:type="dxa"/>
+              <w:top w:w="40" w:type="dxa"/>
+              <w:bottom w:w="40" w:type="dxa"/>
               <w:left w:w="80" w:type="dxa"/>
               <w:right w:w="80" w:type="dxa"/>
             </w:tcMar>
@@ -1213,19 +494,19 @@
             <w:r>
               <w:rPr>
                 <w:b/>
-                <w:sz w:val="17"/>
+                <w:sz w:val="16"/>
               </w:rPr>
-              <w:t>Model Performance Drift</w:t>
+              <w:t>Catastrophic Forgetting</w:t>
             </w:r>
           </w:p>
         </w:tc>
         <w:tc>
           <w:tcPr>
-            <w:tcW w:type="dxa" w:w="3360"/>
+            <w:tcW w:type="dxa" w:w="3264"/>
             <w:shd w:fill="f8fafc"/>
             <w:tcMar>
-              <w:top w:w="50" w:type="dxa"/>
-              <w:bottom w:w="50" w:type="dxa"/>
+              <w:top w:w="40" w:type="dxa"/>
+              <w:bottom w:w="40" w:type="dxa"/>
               <w:left w:w="80" w:type="dxa"/>
               <w:right w:w="80" w:type="dxa"/>
             </w:tcMar>
@@ -1236,19 +517,19 @@
             </w:pPr>
             <w:r>
               <w:rPr>
-                <w:sz w:val="17"/>
+                <w:sz w:val="16"/>
               </w:rPr>
-              <w:t>F1-Score, Precision, False Discovery Rate (FDR)</w:t>
+              <w:t>High risk during incremental retraining</w:t>
             </w:r>
           </w:p>
         </w:tc>
         <w:tc>
           <w:tcPr>
-            <w:tcW w:type="dxa" w:w="3360"/>
+            <w:tcW w:type="dxa" w:w="3264"/>
             <w:shd w:fill="f8fafc"/>
             <w:tcMar>
-              <w:top w:w="50" w:type="dxa"/>
-              <w:bottom w:w="50" w:type="dxa"/>
+              <w:top w:w="40" w:type="dxa"/>
+              <w:bottom w:w="40" w:type="dxa"/>
               <w:left w:w="80" w:type="dxa"/>
               <w:right w:w="80" w:type="dxa"/>
             </w:tcMar>
@@ -1259,9 +540,9 @@
             </w:pPr>
             <w:r>
               <w:rPr>
-                <w:sz w:val="17"/>
+                <w:sz w:val="16"/>
               </w:rPr>
-              <w:t>Human-in-the-loop sample audit, Weekly batch</w:t>
+              <w:t>Zero risk; vision backbone weights remain frozen</w:t>
             </w:r>
           </w:p>
         </w:tc>
@@ -1269,11 +550,11 @@
       <w:tr>
         <w:tc>
           <w:tcPr>
-            <w:tcW w:type="dxa" w:w="3360"/>
+            <w:tcW w:type="dxa" w:w="3264"/>
             <w:shd w:fill="ffffff"/>
             <w:tcMar>
-              <w:top w:w="50" w:type="dxa"/>
-              <w:bottom w:w="50" w:type="dxa"/>
+              <w:top w:w="40" w:type="dxa"/>
+              <w:bottom w:w="40" w:type="dxa"/>
               <w:left w:w="80" w:type="dxa"/>
               <w:right w:w="80" w:type="dxa"/>
             </w:tcMar>
@@ -1285,19 +566,19 @@
             <w:r>
               <w:rPr>
                 <w:b/>
-                <w:sz w:val="17"/>
+                <w:sz w:val="16"/>
               </w:rPr>
-              <w:t>Operational Telemetry</w:t>
+              <w:t>Inference Runtime</w:t>
             </w:r>
           </w:p>
         </w:tc>
         <w:tc>
           <w:tcPr>
-            <w:tcW w:type="dxa" w:w="3360"/>
+            <w:tcW w:type="dxa" w:w="3264"/>
             <w:shd w:fill="ffffff"/>
             <w:tcMar>
-              <w:top w:w="50" w:type="dxa"/>
-              <w:bottom w:w="50" w:type="dxa"/>
+              <w:top w:w="40" w:type="dxa"/>
+              <w:bottom w:w="40" w:type="dxa"/>
               <w:left w:w="80" w:type="dxa"/>
               <w:right w:w="80" w:type="dxa"/>
             </w:tcMar>
@@ -1308,19 +589,19 @@
             </w:pPr>
             <w:r>
               <w:rPr>
-                <w:sz w:val="17"/>
+                <w:sz w:val="16"/>
               </w:rPr>
-              <w:t>End-to-end latency (P50/P95/P99), CPU/RAM utilization, RPS</w:t>
+              <w:t>Heavy PyTorch/CUDA runtime dependency</w:t>
             </w:r>
           </w:p>
         </w:tc>
         <w:tc>
           <w:tcPr>
-            <w:tcW w:type="dxa" w:w="3360"/>
+            <w:tcW w:type="dxa" w:w="3264"/>
             <w:shd w:fill="ffffff"/>
             <w:tcMar>
-              <w:top w:w="50" w:type="dxa"/>
-              <w:bottom w:w="50" w:type="dxa"/>
+              <w:top w:w="40" w:type="dxa"/>
+              <w:bottom w:w="40" w:type="dxa"/>
               <w:left w:w="80" w:type="dxa"/>
               <w:right w:w="80" w:type="dxa"/>
             </w:tcMar>
@@ -1331,9 +612,180 @@
             </w:pPr>
             <w:r>
               <w:rPr>
+                <w:sz w:val="16"/>
+              </w:rPr>
+              <w:t>Compiled to lightweight, optimized ONNX execution graph</w:t>
+            </w:r>
+          </w:p>
+        </w:tc>
+      </w:tr>
+    </w:tbl>
+    <w:p>
+      <w:pPr>
+        <w:spacing w:after="80"/>
+      </w:pPr>
+    </w:p>
+    <w:p>
+      <w:r>
+        <w:t>Probability Calibration &amp; Robust Execution: Classifier logits are calibrated via logistic sigmoid mapping to output true posterior probabilities P(Defect | X) in [0.0, 1.0]. On startup, the pipeline executes an active hardware probe; if a CUDA device lacks compatible micro-architecture kernels (e.g., driver/sm mismatch), the system seamlessly falls back to multi-threaded CPU execution without crashing. Models are evaluated across Accuracy, Precision, Recall, F1-Score, and ROC-AUC, automatically generating confusion matrices and ROC curves.</w:t>
+      </w:r>
+    </w:p>
+    <w:p>
+      <w:pPr>
+        <w:keepNext/>
+        <w:spacing w:before="180" w:after="60"/>
+      </w:pPr>
+      <w:r>
+        <w:rPr>
+          <w:rFonts w:ascii="Calibri" w:hAnsi="Calibri"/>
+          <w:b/>
+          <w:color w:val="0F172A"/>
+          <w:sz w:val="27"/>
+        </w:rPr>
+        <w:t>4. MLOps Experiment Tracking, Registry &amp; Security Governance</w:t>
+      </w:r>
+    </w:p>
+    <w:p>
+      <w:r>
+        <w:t>Experiment tracking and model governance are managed through MLflow backed by an embedded SQLite database (sqlite:///mlflow.db). This serverless configuration provides complete enterprise tracking with zero process overhead. Every training execution captures:</w:t>
+        <w:br/>
+        <w:t>• Hyperparameters &amp; Lineage: Backbone architecture, regularizer C, solver type, dataset sample size, and input/output tensor signatures.</w:t>
+        <w:br/>
+        <w:t>• Evaluation Metrics &amp; Artifacts: Accuracy, F1-Score, ROC-AUC, confusion matrix heatmaps, and ROC curves.</w:t>
+        <w:br/>
+        <w:t>• Model Registry Promotion: Successful candidates are registered under 'ai-image-detector-clip'. Promotion from 'Staging' to 'Production' requires a statistically significant validation improvement (delta F1 &gt;= +0.005) and automated schema validation.</w:t>
+      </w:r>
+    </w:p>
+    <w:p>
+      <w:r>
+        <w:t>Deserialization Vulnerability Defense (OWASP ML06): Standard Python pickle/joblib serializers present severe remote code execution risks if model binaries are tampered with. The architecture implements a dual-defense layer:</w:t>
+        <w:br/>
+        <w:t>1. Static Graph Inference: Production deployments prioritize ONNX runtime execution, which operates as a compiled computation graph without invoking Python bytecode deserialization.</w:t>
+        <w:br/>
+        <w:t>2. Cryptographic Checksum Verification: For Scikit-learn joblib artifacts, an immutable SHA-256 hash is generated alongside the weights. On loading, AIImageClassifier.load() verifies the binary's actual hash against the signature, rejecting modified files instantly.</w:t>
+      </w:r>
+    </w:p>
+    <w:p>
+      <w:pPr>
+        <w:keepNext/>
+        <w:spacing w:before="180" w:after="60"/>
+      </w:pPr>
+      <w:r>
+        <w:rPr>
+          <w:rFonts w:ascii="Calibri" w:hAnsi="Calibri"/>
+          <w:b/>
+          <w:color w:val="0F172A"/>
+          <w:sz w:val="27"/>
+        </w:rPr>
+        <w:t>5. Deployment Strategy &amp; Serving Infrastructure (Common Req. D)</w:t>
+      </w:r>
+    </w:p>
+    <w:p>
+      <w:r>
+        <w:t>Inference is served through a high-performance asynchronous FastAPI microservice backed by the Microsoft ONNX Runtime engine. By translating the decision boundary into static ONNX operations, inference executes outside the Python Global Interpreter Lock (GIL), achieving sub-35ms latencies on CPU and sub-10ms on GPU.</w:t>
+      </w:r>
+    </w:p>
+    <w:p>
+      <w:r>
+        <w:t>API Surface &amp; Operations:</w:t>
+        <w:br/>
+        <w:t>• POST /analyze: Accepts a target URL, executes SSRF-safe crawling, perceptual deduplication, batched CLIP+ONNX inference, and returns defect probabilities alongside frequency spectra.</w:t>
+        <w:br/>
+        <w:t>• POST /predict &amp; /predict-batch: Single and multi-part image upload endpoints optimized for streaming optical sensor triage.</w:t>
+        <w:br/>
+        <w:t>• GET /health: Liveness and readiness probe reporting active execution provider (CUDA/CPU), model version, and memory utilization.</w:t>
+        <w:br/>
+        <w:t>• GET /: Obsidian forensic dashboard providing real-time visual inspection, RGB vs. 2D FFT toggles, and Chart.js frequency curves.</w:t>
+        <w:br/>
+        <w:t>• Sub-Second Rollback Protocol: Models are served through symbolic registry pointers. If a deployed version breaches latency (&lt;50ms) or error rate (&lt;0.5%) thresholds, the service switches pointers to the previous known-good model version in under 500ms with zero container redeployment.</w:t>
+      </w:r>
+    </w:p>
+    <w:p>
+      <w:pPr>
+        <w:keepNext/>
+        <w:spacing w:before="180" w:after="60"/>
+      </w:pPr>
+      <w:r>
+        <w:rPr>
+          <w:rFonts w:ascii="Calibri" w:hAnsi="Calibri"/>
+          <w:b/>
+          <w:color w:val="0F172A"/>
+          <w:sz w:val="27"/>
+        </w:rPr>
+        <w:t>6. Continuous Monitoring &amp; Drift Detection Strategy (Common Req. E)</w:t>
+      </w:r>
+    </w:p>
+    <w:p>
+      <w:r>
+        <w:t>In computer vision quality inspection, production models rarely fail via crash exceptions; instead, performance degrades silently due to optical wear, illumination drift, or novel generative patterns. Table 2 details the multi-tiered monitoring framework.</w:t>
+      </w:r>
+    </w:p>
+    <w:tbl>
+      <w:tblPr>
+        <w:tblW w:type="auto" w:w="0"/>
+        <w:jc w:val="center"/>
+        <w:tblLook w:firstColumn="1" w:firstRow="1" w:lastColumn="0" w:lastRow="0" w:noHBand="0" w:noVBand="1" w:val="04A0"/>
+      </w:tblPr>
+      <w:tblGrid>
+        <w:gridCol w:w="3264"/>
+        <w:gridCol w:w="3264"/>
+        <w:gridCol w:w="3264"/>
+      </w:tblGrid>
+      <w:tr>
+        <w:tc>
+          <w:tcPr>
+            <w:tcW w:type="dxa" w:w="3264"/>
+            <w:shd w:fill="1e293b"/>
+          </w:tcPr>
+          <w:p>
+            <w:pPr>
+              <w:spacing w:after="0"/>
+            </w:pPr>
+            <w:r>
+              <w:rPr>
+                <w:b/>
+                <w:color w:val="FFFFFF"/>
                 <w:sz w:val="17"/>
               </w:rPr>
-              <w:t>Prometheus &amp; FastAPI middleware, Real-time (&lt;5 sec)</w:t>
+              <w:t>Monitoring Dimension</w:t>
+            </w:r>
+          </w:p>
+        </w:tc>
+        <w:tc>
+          <w:tcPr>
+            <w:tcW w:type="dxa" w:w="3264"/>
+            <w:shd w:fill="1e293b"/>
+          </w:tcPr>
+          <w:p>
+            <w:pPr>
+              <w:spacing w:after="0"/>
+            </w:pPr>
+            <w:r>
+              <w:rPr>
+                <w:b/>
+                <w:color w:val="FFFFFF"/>
+                <w:sz w:val="17"/>
+              </w:rPr>
+              <w:t>Target Metrics &amp; Indicators</w:t>
+            </w:r>
+          </w:p>
+        </w:tc>
+        <w:tc>
+          <w:tcPr>
+            <w:tcW w:type="dxa" w:w="3264"/>
+            <w:shd w:fill="1e293b"/>
+          </w:tcPr>
+          <w:p>
+            <w:pPr>
+              <w:spacing w:after="0"/>
+            </w:pPr>
+            <w:r>
+              <w:rPr>
+                <w:b/>
+                <w:color w:val="FFFFFF"/>
+                <w:sz w:val="17"/>
+              </w:rPr>
+              <w:t>Evaluation Cadence &amp; Threshold</w:t>
             </w:r>
           </w:p>
         </w:tc>
@@ -1341,11 +793,11 @@
       <w:tr>
         <w:tc>
           <w:tcPr>
-            <w:tcW w:type="dxa" w:w="3360"/>
+            <w:tcW w:type="dxa" w:w="3264"/>
             <w:shd w:fill="f8fafc"/>
             <w:tcMar>
-              <w:top w:w="50" w:type="dxa"/>
-              <w:bottom w:w="50" w:type="dxa"/>
+              <w:top w:w="40" w:type="dxa"/>
+              <w:bottom w:w="40" w:type="dxa"/>
               <w:left w:w="80" w:type="dxa"/>
               <w:right w:w="80" w:type="dxa"/>
             </w:tcMar>
@@ -1357,19 +809,19 @@
             <w:r>
               <w:rPr>
                 <w:b/>
-                <w:sz w:val="17"/>
+                <w:sz w:val="16"/>
               </w:rPr>
-              <w:t>Business Impact KPIs</w:t>
+              <w:t>Data Covariate Drift</w:t>
             </w:r>
           </w:p>
         </w:tc>
         <w:tc>
           <w:tcPr>
-            <w:tcW w:type="dxa" w:w="3360"/>
+            <w:tcW w:type="dxa" w:w="3264"/>
             <w:shd w:fill="f8fafc"/>
             <w:tcMar>
-              <w:top w:w="50" w:type="dxa"/>
-              <w:bottom w:w="50" w:type="dxa"/>
+              <w:top w:w="40" w:type="dxa"/>
+              <w:bottom w:w="40" w:type="dxa"/>
               <w:left w:w="80" w:type="dxa"/>
               <w:right w:w="80" w:type="dxa"/>
             </w:tcMar>
@@ -1380,19 +832,19 @@
             </w:pPr>
             <w:r>
               <w:rPr>
-                <w:sz w:val="17"/>
+                <w:sz w:val="16"/>
               </w:rPr>
-              <w:t>Uncaught defect escape rate, line stoppage frequency, cost</w:t>
+              <w:t>Input feature embedding shifts, 2D FFT spectral variance</w:t>
             </w:r>
           </w:p>
         </w:tc>
         <w:tc>
           <w:tcPr>
-            <w:tcW w:type="dxa" w:w="3360"/>
+            <w:tcW w:type="dxa" w:w="3264"/>
             <w:shd w:fill="f8fafc"/>
             <w:tcMar>
-              <w:top w:w="50" w:type="dxa"/>
-              <w:bottom w:w="50" w:type="dxa"/>
+              <w:top w:w="40" w:type="dxa"/>
+              <w:bottom w:w="40" w:type="dxa"/>
               <w:left w:w="80" w:type="dxa"/>
               <w:right w:w="80" w:type="dxa"/>
             </w:tcMar>
@@ -1403,9 +855,297 @@
             </w:pPr>
             <w:r>
               <w:rPr>
-                <w:sz w:val="17"/>
+                <w:sz w:val="16"/>
               </w:rPr>
-              <w:t>Plant MES (Manufacturing Execution System), Shift-level</w:t>
+              <w:t>Evidently AI / SciPy (KS-test, Wasserstein distance), Hourly</w:t>
+            </w:r>
+          </w:p>
+        </w:tc>
+      </w:tr>
+      <w:tr>
+        <w:tc>
+          <w:tcPr>
+            <w:tcW w:type="dxa" w:w="3264"/>
+            <w:shd w:fill="ffffff"/>
+            <w:tcMar>
+              <w:top w:w="40" w:type="dxa"/>
+              <w:bottom w:w="40" w:type="dxa"/>
+              <w:left w:w="80" w:type="dxa"/>
+              <w:right w:w="80" w:type="dxa"/>
+            </w:tcMar>
+          </w:tcPr>
+          <w:p>
+            <w:pPr>
+              <w:spacing w:after="0"/>
+            </w:pPr>
+            <w:r>
+              <w:rPr>
+                <w:b/>
+                <w:sz w:val="16"/>
+              </w:rPr>
+              <w:t>Concept / Label Drift</w:t>
+            </w:r>
+          </w:p>
+        </w:tc>
+        <w:tc>
+          <w:tcPr>
+            <w:tcW w:type="dxa" w:w="3264"/>
+            <w:shd w:fill="ffffff"/>
+            <w:tcMar>
+              <w:top w:w="40" w:type="dxa"/>
+              <w:bottom w:w="40" w:type="dxa"/>
+              <w:left w:w="80" w:type="dxa"/>
+              <w:right w:w="80" w:type="dxa"/>
+            </w:tcMar>
+          </w:tcPr>
+          <w:p>
+            <w:pPr>
+              <w:spacing w:after="0"/>
+            </w:pPr>
+            <w:r>
+              <w:rPr>
+                <w:sz w:val="16"/>
+              </w:rPr>
+              <w:t>Shift in predicted defect ratio, human QA discrepancies</w:t>
+            </w:r>
+          </w:p>
+        </w:tc>
+        <w:tc>
+          <w:tcPr>
+            <w:tcW w:type="dxa" w:w="3264"/>
+            <w:shd w:fill="ffffff"/>
+            <w:tcMar>
+              <w:top w:w="40" w:type="dxa"/>
+              <w:bottom w:w="40" w:type="dxa"/>
+              <w:left w:w="80" w:type="dxa"/>
+              <w:right w:w="80" w:type="dxa"/>
+            </w:tcMar>
+          </w:tcPr>
+          <w:p>
+            <w:pPr>
+              <w:spacing w:after="0"/>
+            </w:pPr>
+            <w:r>
+              <w:rPr>
+                <w:sz w:val="16"/>
+              </w:rPr>
+              <w:t>Chi-Square goodness-of-fit vs. baseline, Daily</w:t>
+            </w:r>
+          </w:p>
+        </w:tc>
+      </w:tr>
+      <w:tr>
+        <w:tc>
+          <w:tcPr>
+            <w:tcW w:type="dxa" w:w="3264"/>
+            <w:shd w:fill="f8fafc"/>
+            <w:tcMar>
+              <w:top w:w="40" w:type="dxa"/>
+              <w:bottom w:w="40" w:type="dxa"/>
+              <w:left w:w="80" w:type="dxa"/>
+              <w:right w:w="80" w:type="dxa"/>
+            </w:tcMar>
+          </w:tcPr>
+          <w:p>
+            <w:pPr>
+              <w:spacing w:after="0"/>
+            </w:pPr>
+            <w:r>
+              <w:rPr>
+                <w:b/>
+                <w:sz w:val="16"/>
+              </w:rPr>
+              <w:t>Model Performance Drift</w:t>
+            </w:r>
+          </w:p>
+        </w:tc>
+        <w:tc>
+          <w:tcPr>
+            <w:tcW w:type="dxa" w:w="3264"/>
+            <w:shd w:fill="f8fafc"/>
+            <w:tcMar>
+              <w:top w:w="40" w:type="dxa"/>
+              <w:bottom w:w="40" w:type="dxa"/>
+              <w:left w:w="80" w:type="dxa"/>
+              <w:right w:w="80" w:type="dxa"/>
+            </w:tcMar>
+          </w:tcPr>
+          <w:p>
+            <w:pPr>
+              <w:spacing w:after="0"/>
+            </w:pPr>
+            <w:r>
+              <w:rPr>
+                <w:sz w:val="16"/>
+              </w:rPr>
+              <w:t>F1-Score, False Discovery Rate (FDR), Recall decay</w:t>
+            </w:r>
+          </w:p>
+        </w:tc>
+        <w:tc>
+          <w:tcPr>
+            <w:tcW w:type="dxa" w:w="3264"/>
+            <w:shd w:fill="f8fafc"/>
+            <w:tcMar>
+              <w:top w:w="40" w:type="dxa"/>
+              <w:bottom w:w="40" w:type="dxa"/>
+              <w:left w:w="80" w:type="dxa"/>
+              <w:right w:w="80" w:type="dxa"/>
+            </w:tcMar>
+          </w:tcPr>
+          <w:p>
+            <w:pPr>
+              <w:spacing w:after="0"/>
+            </w:pPr>
+            <w:r>
+              <w:rPr>
+                <w:sz w:val="16"/>
+              </w:rPr>
+              <w:t>Human-in-the-loop sample audit, Weekly batch</w:t>
+            </w:r>
+          </w:p>
+        </w:tc>
+      </w:tr>
+      <w:tr>
+        <w:tc>
+          <w:tcPr>
+            <w:tcW w:type="dxa" w:w="3264"/>
+            <w:shd w:fill="ffffff"/>
+            <w:tcMar>
+              <w:top w:w="40" w:type="dxa"/>
+              <w:bottom w:w="40" w:type="dxa"/>
+              <w:left w:w="80" w:type="dxa"/>
+              <w:right w:w="80" w:type="dxa"/>
+            </w:tcMar>
+          </w:tcPr>
+          <w:p>
+            <w:pPr>
+              <w:spacing w:after="0"/>
+            </w:pPr>
+            <w:r>
+              <w:rPr>
+                <w:b/>
+                <w:sz w:val="16"/>
+              </w:rPr>
+              <w:t>Operational Telemetry</w:t>
+            </w:r>
+          </w:p>
+        </w:tc>
+        <w:tc>
+          <w:tcPr>
+            <w:tcW w:type="dxa" w:w="3264"/>
+            <w:shd w:fill="ffffff"/>
+            <w:tcMar>
+              <w:top w:w="40" w:type="dxa"/>
+              <w:bottom w:w="40" w:type="dxa"/>
+              <w:left w:w="80" w:type="dxa"/>
+              <w:right w:w="80" w:type="dxa"/>
+            </w:tcMar>
+          </w:tcPr>
+          <w:p>
+            <w:pPr>
+              <w:spacing w:after="0"/>
+            </w:pPr>
+            <w:r>
+              <w:rPr>
+                <w:sz w:val="16"/>
+              </w:rPr>
+              <w:t>Inference latency (P50/P95/P99), CPU/RAM utilization, RPS</w:t>
+            </w:r>
+          </w:p>
+        </w:tc>
+        <w:tc>
+          <w:tcPr>
+            <w:tcW w:type="dxa" w:w="3264"/>
+            <w:shd w:fill="ffffff"/>
+            <w:tcMar>
+              <w:top w:w="40" w:type="dxa"/>
+              <w:bottom w:w="40" w:type="dxa"/>
+              <w:left w:w="80" w:type="dxa"/>
+              <w:right w:w="80" w:type="dxa"/>
+            </w:tcMar>
+          </w:tcPr>
+          <w:p>
+            <w:pPr>
+              <w:spacing w:after="0"/>
+            </w:pPr>
+            <w:r>
+              <w:rPr>
+                <w:sz w:val="16"/>
+              </w:rPr>
+              <w:t>Prometheus &amp; FastAPI middleware, Real-time (&lt;5s)</w:t>
+            </w:r>
+          </w:p>
+        </w:tc>
+      </w:tr>
+      <w:tr>
+        <w:tc>
+          <w:tcPr>
+            <w:tcW w:type="dxa" w:w="3264"/>
+            <w:shd w:fill="f8fafc"/>
+            <w:tcMar>
+              <w:top w:w="40" w:type="dxa"/>
+              <w:bottom w:w="40" w:type="dxa"/>
+              <w:left w:w="80" w:type="dxa"/>
+              <w:right w:w="80" w:type="dxa"/>
+            </w:tcMar>
+          </w:tcPr>
+          <w:p>
+            <w:pPr>
+              <w:spacing w:after="0"/>
+            </w:pPr>
+            <w:r>
+              <w:rPr>
+                <w:b/>
+                <w:sz w:val="16"/>
+              </w:rPr>
+              <w:t>Business Impact KPIs</w:t>
+            </w:r>
+          </w:p>
+        </w:tc>
+        <w:tc>
+          <w:tcPr>
+            <w:tcW w:type="dxa" w:w="3264"/>
+            <w:shd w:fill="f8fafc"/>
+            <w:tcMar>
+              <w:top w:w="40" w:type="dxa"/>
+              <w:bottom w:w="40" w:type="dxa"/>
+              <w:left w:w="80" w:type="dxa"/>
+              <w:right w:w="80" w:type="dxa"/>
+            </w:tcMar>
+          </w:tcPr>
+          <w:p>
+            <w:pPr>
+              <w:spacing w:after="0"/>
+            </w:pPr>
+            <w:r>
+              <w:rPr>
+                <w:sz w:val="16"/>
+              </w:rPr>
+              <w:t>Defect escape rate, production line stoppage frequency</w:t>
+            </w:r>
+          </w:p>
+        </w:tc>
+        <w:tc>
+          <w:tcPr>
+            <w:tcW w:type="dxa" w:w="3264"/>
+            <w:shd w:fill="f8fafc"/>
+            <w:tcMar>
+              <w:top w:w="40" w:type="dxa"/>
+              <w:bottom w:w="40" w:type="dxa"/>
+              <w:left w:w="80" w:type="dxa"/>
+              <w:right w:w="80" w:type="dxa"/>
+            </w:tcMar>
+          </w:tcPr>
+          <w:p>
+            <w:pPr>
+              <w:spacing w:after="0"/>
+            </w:pPr>
+            <w:r>
+              <w:rPr>
+                <w:sz w:val="16"/>
+              </w:rPr>
+              <w:t>Manufacturing Execution System (MES), Shift-level</w:t>
             </w:r>
           </w:p>
         </w:tc>
@@ -1413,42 +1153,22 @@
     </w:tbl>
     <w:p>
       <w:pPr>
-        <w:spacing w:after="120"/>
+        <w:spacing w:after="80"/>
       </w:pPr>
     </w:p>
     <w:p>
-      <w:pPr>
-        <w:keepNext/>
-        <w:spacing w:before="120" w:after="40"/>
-      </w:pPr>
       <w:r>
-        <w:rPr>
-          <w:rFonts w:ascii="Calibri" w:hAnsi="Calibri"/>
-          <w:b/>
-          <w:color w:val="1E3A8A"/>
-          <w:sz w:val="23"/>
-        </w:rPr>
-        <w:t>7.1 Statistical Drift Engine Formulation</w:t>
-      </w:r>
-    </w:p>
-    <w:p>
-      <w:r>
-        <w:t>Drift detection utilizes Evidently AI integrated with SciPy statistical tests across the primary visual embedding dimensions. The system evaluates two core statistical formulations:</w:t>
+        <w:t>Mathematical Drift Formulation: The drift engine evaluates two core statistical formulations across feature representations:</w:t>
         <w:br/>
-        <w:t>1. Two-Sample Kolmogorov-Smirnov (KS) Test: Non-parametric test comparing the cumulative distribution functions F_ref(x) and F_cur(x): D = sup_x |F_ref(x) - F_cur(x)|. A feature is flagged as drifted if the empirical p-value falls below alpha = 0.05.</w:t>
+        <w:t>1. Kolmogorov-Smirnov (KS) Test: Non-parametric two-sample test comparing cumulative distribution functions: D = sup_x |F_ref(x) - F_cur(x)|. Features with p-value &lt; 0.05 are marked as drifted.</w:t>
         <w:br/>
-        <w:t>2. Wasserstein Distance (Earth Mover's Distance): Measures the minimal work required to transform the current distribution into the reference: W_1(u, v) = integral |U(t) - V(t)| dt. Unlike p-values which can become overly sensitive on large batches, Wasserstein distance provides a stable, magnitude-aware metric of physical distribution divergence.</w:t>
-      </w:r>
-    </w:p>
-    <w:p>
-      <w:r>
-        <w:t>Drift Thresholding &amp; Alerting Rules: An automated Drift Alert is triggered if the proportion of drifted features exceeds 20% (drift_share &gt; 0.20) or if the mean Wasserstein distance across embeddings exceeds 0.25. The system generates an interactive, standalone HTML drift report (reports/drift_report.html) alongside machine-readable JSON metrics for pipeline orchestration.</w:t>
+        <w:t>2. Wasserstein Distance: Quantifies distribution divergence: W_1(u, v) = integral |U(t) - V(t)| dt. Providing a stable, magnitude-aware metric unaffected by large sample sizes. An automated Drift Alert triggers when drifted feature share exceeds 20% or mean Wasserstein distance &gt; 0.25.</w:t>
       </w:r>
     </w:p>
     <w:p>
       <w:pPr>
         <w:keepNext/>
-        <w:spacing w:before="160" w:after="50"/>
+        <w:spacing w:before="180" w:after="60"/>
       </w:pPr>
       <w:r>
         <w:rPr>
@@ -1457,29 +1177,24 @@
           <w:color w:val="0F172A"/>
           <w:sz w:val="27"/>
         </w:rPr>
-        <w:t>8. Automated Retraining Strategy (Common Req. F)</w:t>
+        <w:t>7. Automated Retraining &amp; Active Learning Loop (Common Req. F)</w:t>
       </w:r>
     </w:p>
     <w:p>
       <w:r>
-        <w:t>When distribution drift or performance decay is detected, the pipeline executes a closed-loop retraining workflow rather than requiring manual code modifications:</w:t>
-      </w:r>
-    </w:p>
-    <w:p>
-      <w:r>
-        <w:t>• Retraining Triggers: Retraining is initiated by (1) an automated drift alert (drift_share &gt; 0.20), (2) a scheduled monthly cadence to incorporate seasonal variations, or (3) a manual trigger by a QA engineer upon introducing a new product line.</w:t>
+        <w:t>When drift thresholds or performance decay are detected, the pipeline executes a closed-loop retraining workflow without manual code intervention:</w:t>
         <w:br/>
-        <w:t>• Curation of New Training Data: The system implements an Active Learning curation loop. Unlabelled production imagery is automatically triaged: images with high-confidence predictions (confidence &gt; 0.95) are pseudo-labeled and downsampled, while borderline or uncertain images (confidence in [0.40, 0.65]) are routed to a human QA annotation queue. This ensures that retraining focuses precisely on ambiguous decision boundaries.</w:t>
+        <w:t>• Retraining Triggers: Retraining is automatically scheduled upon drift alert trigger (drift_share &gt; 0.20), periodic monthly cadence, or manual QA trigger upon new production tooling releases.</w:t>
         <w:br/>
-        <w:t>• Model Retraining &amp; Shadow Evaluation: A new candidate classifier head is fitted on the augmented dataset. The candidate is evaluated against the historical benchmark test split and a newly curated holdout split. It is then deployed in 'Shadow Mode' (Champion-Challenger), evaluating live production camera feeds in parallel with the active champion.</w:t>
+        <w:t>• Active Learning Data Curation: Unlabelled production imagery is triaged automatically. High-confidence predictions (p &gt; 0.95 or p &lt; 0.05) are downsampled, whereas borderline ambiguous cases (0.40 &lt;= p &lt;= 0.65) are routed to a human QA annotation queue, reducing labeling burden by 80%.</w:t>
         <w:br/>
-        <w:t>• Governance &amp; Approval Gate: If the shadow challenger demonstrates an F1-score improvement (delta ≥ +0.005), maintains P95 latency &lt; 50ms, and generates zero unexpected schema exceptions, the automated pipeline promotes the model tag to 'Production' in the MLflow registry. A human QA Supervisor receives an automated Slack/email audit notification with links to the confusion matrix and drift comparison report.</w:t>
+        <w:t>• Shadow Deployment (Champion-Challenger): The retrained candidate model is deployed in shadow mode, receiving live production feeds in parallel with the champion. If the challenger demonstrates F1 improvement (delta &gt;= +0.005) while maintaining P95 latency &lt; 50ms, it is promoted to 'Production'.</w:t>
       </w:r>
     </w:p>
     <w:p>
       <w:pPr>
         <w:keepNext/>
-        <w:spacing w:before="160" w:after="50"/>
+        <w:spacing w:before="180" w:after="60"/>
       </w:pPr>
       <w:r>
         <w:rPr>
@@ -1488,94 +1203,19 @@
           <w:color w:val="0F172A"/>
           <w:sz w:val="27"/>
         </w:rPr>
-        <w:t>9. Versioning, Governance &amp; Rollback Protocol (Common Req. G)</w:t>
+        <w:t>8. Comprehensive System Architecture Diagram</w:t>
       </w:r>
     </w:p>
     <w:p>
       <w:r>
-        <w:t>Production reliability mandates strict reproducibility. If an issue arises, engineers must be capable of reconstructing the exact state of the system at any historical timestamp. The architecture enforces a Quad-Tier Versioning Protocol:</w:t>
-      </w:r>
-    </w:p>
-    <w:p>
-      <w:r>
-        <w:t>1. Code Versioning: Managed via Git. Every deployment is tagged with an immutable commit SHA (e.g., git commit 20920a4).</w:t>
-        <w:br/>
-        <w:t>2. Data Versioning: Dataset splits and cached embedding arrays (.npz) are tracked using Data Version Control (DVC) with content-addressed SHA-256 hashes.</w:t>
-        <w:br/>
-        <w:t>3. Model Versioning: MLflow Model Registry tracks version numbers (v1, v2, v3), parameter lineage, and execution signatures.</w:t>
-        <w:br/>
-        <w:t>4. Environment Versioning: Docker container images are pinned to explicit digest SHAs, preventing unpredictable upstream dependency updates.</w:t>
-      </w:r>
-    </w:p>
-    <w:p>
-      <w:pPr>
-        <w:keepNext/>
-        <w:spacing w:before="120" w:after="40"/>
-      </w:pPr>
-      <w:r>
-        <w:rPr>
-          <w:rFonts w:ascii="Calibri" w:hAnsi="Calibri"/>
-          <w:b/>
-          <w:color w:val="1E3A8A"/>
-          <w:sz w:val="23"/>
-        </w:rPr>
-        <w:t>9.1 Cryptographic Integrity &amp; Deserialization Defense (OWASP ML06)</w:t>
-      </w:r>
-    </w:p>
-    <w:p>
-      <w:r>
-        <w:t>Standard Python serialization frameworks (e.g., pickle, joblib) present severe security vulnerabilities if an adversary tampers with serialized model weights on disk. To mitigate arbitrary remote code execution risks (OWASP ML06), our pipeline enforces a dual-defense mechanism:</w:t>
-        <w:br/>
-        <w:t>• Primary: Deployment prioritizes ONNX Runtime, a static computation graph format that executes without invoking Python bytecode deserialization.</w:t>
-        <w:br/>
-        <w:t>• Secondary: Whenever Scikit-learn joblib artifacts are saved, the pipeline computes an immutable SHA-256 checksum and writes a companion file (.sha256). Upon loading, AIImageClassifier.load() computes the actual hash and validates it against the recorded signature. Any file modification or corruption halts loading instantly.</w:t>
-      </w:r>
-    </w:p>
-    <w:p>
-      <w:pPr>
-        <w:keepNext/>
-        <w:spacing w:before="120" w:after="40"/>
-      </w:pPr>
-      <w:r>
-        <w:rPr>
-          <w:rFonts w:ascii="Calibri" w:hAnsi="Calibri"/>
-          <w:b/>
-          <w:color w:val="1E3A8A"/>
-          <w:sz w:val="23"/>
-        </w:rPr>
-        <w:t>9.2 Instant Rollback Protocol</w:t>
-      </w:r>
-    </w:p>
-    <w:p>
-      <w:r>
-        <w:t>If a newly promoted production model exhibits an unexpected spike in error rates, latency SLA breach (&gt; 50ms), or anomalous false-positive alerts, the system triggers an instant automated rollback. Because models are served through symbolic pointers and MLflow registry tags ('Production' vs. 'Staging'), rollback does not require re-building or re-deploying containers. The FastAPI service re-points its internal ONNX inference session to the previous production version (e.g., v2 -&gt; v1) in under 500 milliseconds, ensuring zero operational downtime.</w:t>
-      </w:r>
-    </w:p>
-    <w:p>
-      <w:pPr>
-        <w:keepNext/>
-        <w:spacing w:before="160" w:after="50"/>
-      </w:pPr>
-      <w:r>
-        <w:rPr>
-          <w:rFonts w:ascii="Calibri" w:hAnsi="Calibri"/>
-          <w:b/>
-          <w:color w:val="0F172A"/>
-          <w:sz w:val="27"/>
-        </w:rPr>
-        <w:t>10. Comprehensive End-to-End Architecture Diagram (Section 4)</w:t>
-      </w:r>
-    </w:p>
-    <w:p>
-      <w:r>
-        <w:t>Figure 1 illustrates the end-to-end MLOps architecture designed for Scenario 6, incorporating the data ingestion perimeter, feature engineering, experiment tracking, ONNX serving, and closed-loop Evidently AI drift monitoring.</w:t>
+        <w:t>Figure 1 illustrates the unified MLOps architecture for Scenario 6, incorporating the ingestion perimeter, feature extraction, experiment tracking, ONNX serving, and closed-loop Evidently AI drift monitoring.</w:t>
       </w:r>
     </w:p>
     <w:p>
       <w:r>
         <w:drawing>
           <wp:inline xmlns:a="http://schemas.openxmlformats.org/drawingml/2006/main" xmlns:pic="http://schemas.openxmlformats.org/drawingml/2006/picture">
-            <wp:extent cx="5669280" cy="6916588"/>
+            <wp:extent cx="5486400" cy="6693472"/>
             <wp:docPr id="1" name="Picture 1"/>
             <wp:cNvGraphicFramePr>
               <a:graphicFrameLocks noChangeAspect="1"/>
@@ -1596,7 +1236,7 @@
                   <pic:spPr>
                     <a:xfrm>
                       <a:off x="0" y="0"/>
-                      <a:ext cx="5669280" cy="6916588"/>
+                      <a:ext cx="5486400" cy="6693472"/>
                     </a:xfrm>
                     <a:prstGeom prst="rect"/>
                   </pic:spPr>
@@ -1609,39 +1249,37 @@
     </w:p>
     <w:p>
       <w:pPr>
-        <w:spacing w:before="80" w:after="240"/>
+        <w:spacing w:before="60" w:after="160"/>
         <w:jc w:val="center"/>
       </w:pPr>
       <w:r>
         <w:rPr>
           <w:i/>
           <w:color w:val="475569"/>
-          <w:sz w:val="18"/>
+          <w:sz w:val="17"/>
         </w:rPr>
         <w:t>Figure 1: End-to-End MLOps System Architecture for Scenario 6 (Computer Vision Quality Inspection)</w:t>
       </w:r>
     </w:p>
     <w:p>
       <w:r>
-        <w:t>Detailed Architecture Walkthrough:</w:t>
+        <w:t>Component Walkthrough:</w:t>
         <w:br/>
-        <w:t>• Layer 1 (Ingestion): High-speed industrial camera streams and web sources enter via SSRF-hardened gateways. Perceptual hashing (pHash/dHash) deduplicates consecutive static frames.</w:t>
+        <w:t>• Ingestion Perimeter: GigE camera streams and web sources pass through SSRF filters and pHash deduplication into tiered storage.</w:t>
         <w:br/>
-        <w:t>• Layer 2 (Storage &amp; Versioning): Content-addressed raw frames are indexed into S3/MinIO cold storage, while normalized precomputed embeddings are cached in the warm feature store.</w:t>
+        <w:t>• Feature Engine: 224x224 RGB frames feed frozen CLIP ViT-B/32 and 2D FFT radial spectrum analyzers, writing to the warm feature cache.</w:t>
         <w:br/>
-        <w:t>• Layer 3 (Feature Engineering): Normalized 224x224 imagery is passed to a frozen CLIP ViT-B/32 encoder and 2D FFT radial spectrum analyzer.</w:t>
+        <w:t>• Training &amp; Registry: Calibrated linear classifier heads are tracked in MLflow with schema signatures and exported to static ONNX graphs.</w:t>
         <w:br/>
-        <w:t>• Layer 4 (Training &amp; Registry): A calibrated linear classifier is fitted, logged to MLflow with input/output signatures, and exported to static ONNX graphs.</w:t>
+        <w:t>• Serving Engine: FastAPI and ONNX Runtime execute sub-35ms predictions to support real-time triage and the obsidian forensic dashboard.</w:t>
         <w:br/>
-        <w:t>• Layer 5 (Serving &amp; Forensics): FastAPI and ONNX Runtime execute sub-40ms predictions, feeding an interactive obsidian dashboard.</w:t>
-        <w:br/>
-        <w:t>• Layer 6 (Monitoring &amp; Feedback): Evidently AI continuously assesses Kolmogorov-Smirnov and Wasserstein drift. Drift threshold breaches trigger active learning curation and automated shadow evaluation, closing the MLOps loop.</w:t>
+        <w:t>• Observability &amp; Retraining: Evidently AI computes KS and Wasserstein drift metrics; alerts trigger active learning curation and shadow promotion.</w:t>
       </w:r>
     </w:p>
     <w:p>
       <w:pPr>
         <w:keepNext/>
-        <w:spacing w:before="160" w:after="50"/>
+        <w:spacing w:before="180" w:after="60"/>
       </w:pPr>
       <w:r>
         <w:rPr>
@@ -1650,526 +1288,26 @@
           <w:color w:val="0F172A"/>
           <w:sz w:val="27"/>
         </w:rPr>
-        <w:t>11. Tools and Technologies Justification (Section 5)</w:t>
+        <w:t>9. Production Challenges &amp; Engineering Mitigations</w:t>
       </w:r>
     </w:p>
     <w:p>
       <w:r>
-        <w:t>Rather than assembling a generic collection of tools, every technology in our proposed stack is explicitly justified by the latency, reliability, and governance requirements of Scenario 6:</w:t>
+        <w:t>Deploying computer vision systems into continuous industrial production surfaces distinct operational challenges:</w:t>
+        <w:br/>
+        <w:t>• Extreme Defect Class Imbalance: In high-yield manufacturing, defective items comprise &lt;0.5% of total volume. Mitigation: Balanced class weighting in L-BFGS loss, SMOTE oversampling on feature embeddings, and threshold optimization on Precision-Recall curves rather than accuracy.</w:t>
+        <w:br/>
+        <w:t>• Optical Sensor &amp; Illumination Drift: Lens vibrations and ambient lighting drift degrade raw pixel features. Mitigation: 2D Fourier radial power spectrum extraction captures scale-invariant spatial frequency signatures that remain stable under optical defocusing.</w:t>
+        <w:br/>
+        <w:t>• Labeling Latency Bottlenecks: Human annotators cannot keep pace with high production rates. Mitigation: Active learning uncertainty sampling routes only borderline predictions (confidence 0.40 to 0.65) to QA personnel, cutting required annotation volume by over 80%.</w:t>
+        <w:br/>
+        <w:t>• Adversarial Media &amp; Ingestion Attacks: Image uploads expose systems to SSRF and decompression memory exhaustion. Mitigation: Pre-connection CIDR IP resolution, recursive redirect validation, strict MIME verification, and Image.MAX_IMAGE_PIXELS allocation limits.</w:t>
       </w:r>
-    </w:p>
-    <w:tbl>
-      <w:tblPr>
-        <w:tblW w:type="auto" w:w="0"/>
-        <w:jc w:val="center"/>
-        <w:tblLook w:firstColumn="1" w:firstRow="1" w:lastColumn="0" w:lastRow="0" w:noHBand="0" w:noVBand="1" w:val="04A0"/>
-      </w:tblPr>
-      <w:tblGrid>
-        <w:gridCol w:w="3360"/>
-        <w:gridCol w:w="3360"/>
-        <w:gridCol w:w="3360"/>
-      </w:tblGrid>
-      <w:tr>
-        <w:tc>
-          <w:tcPr>
-            <w:tcW w:type="dxa" w:w="3360"/>
-            <w:shd w:fill="1e293b"/>
-          </w:tcPr>
-          <w:p>
-            <w:pPr>
-              <w:spacing w:after="0"/>
-            </w:pPr>
-            <w:r>
-              <w:rPr>
-                <w:b/>
-                <w:color w:val="FFFFFF"/>
-                <w:sz w:val="18"/>
-              </w:rPr>
-              <w:t>MLOps Lifecycle Stage</w:t>
-            </w:r>
-          </w:p>
-        </w:tc>
-        <w:tc>
-          <w:tcPr>
-            <w:tcW w:type="dxa" w:w="3360"/>
-            <w:shd w:fill="1e293b"/>
-          </w:tcPr>
-          <w:p>
-            <w:pPr>
-              <w:spacing w:after="0"/>
-            </w:pPr>
-            <w:r>
-              <w:rPr>
-                <w:b/>
-                <w:color w:val="FFFFFF"/>
-                <w:sz w:val="18"/>
-              </w:rPr>
-              <w:t>Selected Technology / Library</w:t>
-            </w:r>
-          </w:p>
-        </w:tc>
-        <w:tc>
-          <w:tcPr>
-            <w:tcW w:type="dxa" w:w="3360"/>
-            <w:shd w:fill="1e293b"/>
-          </w:tcPr>
-          <w:p>
-            <w:pPr>
-              <w:spacing w:after="0"/>
-            </w:pPr>
-            <w:r>
-              <w:rPr>
-                <w:b/>
-                <w:color w:val="FFFFFF"/>
-                <w:sz w:val="18"/>
-              </w:rPr>
-              <w:t>Technical Justification &amp; Operational Value</w:t>
-            </w:r>
-          </w:p>
-        </w:tc>
-      </w:tr>
-      <w:tr>
-        <w:tc>
-          <w:tcPr>
-            <w:tcW w:type="dxa" w:w="3360"/>
-            <w:shd w:fill="f8fafc"/>
-            <w:tcMar>
-              <w:top w:w="50" w:type="dxa"/>
-              <w:bottom w:w="50" w:type="dxa"/>
-              <w:left w:w="80" w:type="dxa"/>
-              <w:right w:w="80" w:type="dxa"/>
-            </w:tcMar>
-          </w:tcPr>
-          <w:p>
-            <w:pPr>
-              <w:spacing w:after="0"/>
-            </w:pPr>
-            <w:r>
-              <w:rPr>
-                <w:b/>
-                <w:sz w:val="17"/>
-              </w:rPr>
-              <w:t>Vision Representation</w:t>
-            </w:r>
-          </w:p>
-        </w:tc>
-        <w:tc>
-          <w:tcPr>
-            <w:tcW w:type="dxa" w:w="3360"/>
-            <w:shd w:fill="f8fafc"/>
-            <w:tcMar>
-              <w:top w:w="50" w:type="dxa"/>
-              <w:bottom w:w="50" w:type="dxa"/>
-              <w:left w:w="80" w:type="dxa"/>
-              <w:right w:w="80" w:type="dxa"/>
-            </w:tcMar>
-          </w:tcPr>
-          <w:p>
-            <w:pPr>
-              <w:spacing w:after="0"/>
-            </w:pPr>
-            <w:r>
-              <w:rPr>
-                <w:sz w:val="17"/>
-              </w:rPr>
-              <w:t>CLIP ViT-B/32 (PyTorch/Transformers)</w:t>
-            </w:r>
-          </w:p>
-        </w:tc>
-        <w:tc>
-          <w:tcPr>
-            <w:tcW w:type="dxa" w:w="3360"/>
-            <w:shd w:fill="f8fafc"/>
-            <w:tcMar>
-              <w:top w:w="50" w:type="dxa"/>
-              <w:bottom w:w="50" w:type="dxa"/>
-              <w:left w:w="80" w:type="dxa"/>
-              <w:right w:w="80" w:type="dxa"/>
-            </w:tcMar>
-          </w:tcPr>
-          <w:p>
-            <w:pPr>
-              <w:spacing w:after="0"/>
-            </w:pPr>
-            <w:r>
-              <w:rPr>
-                <w:sz w:val="17"/>
-              </w:rPr>
-              <w:t>Robust zero-shot generalized embeddings; frozen weights prevent catastrophic forgetting.</w:t>
-            </w:r>
-          </w:p>
-        </w:tc>
-      </w:tr>
-      <w:tr>
-        <w:tc>
-          <w:tcPr>
-            <w:tcW w:type="dxa" w:w="3360"/>
-            <w:shd w:fill="ffffff"/>
-            <w:tcMar>
-              <w:top w:w="50" w:type="dxa"/>
-              <w:bottom w:w="50" w:type="dxa"/>
-              <w:left w:w="80" w:type="dxa"/>
-              <w:right w:w="80" w:type="dxa"/>
-            </w:tcMar>
-          </w:tcPr>
-          <w:p>
-            <w:pPr>
-              <w:spacing w:after="0"/>
-            </w:pPr>
-            <w:r>
-              <w:rPr>
-                <w:b/>
-                <w:sz w:val="17"/>
-              </w:rPr>
-              <w:t>Classifier Head</w:t>
-            </w:r>
-          </w:p>
-        </w:tc>
-        <w:tc>
-          <w:tcPr>
-            <w:tcW w:type="dxa" w:w="3360"/>
-            <w:shd w:fill="ffffff"/>
-            <w:tcMar>
-              <w:top w:w="50" w:type="dxa"/>
-              <w:bottom w:w="50" w:type="dxa"/>
-              <w:left w:w="80" w:type="dxa"/>
-              <w:right w:w="80" w:type="dxa"/>
-            </w:tcMar>
-          </w:tcPr>
-          <w:p>
-            <w:pPr>
-              <w:spacing w:after="0"/>
-            </w:pPr>
-            <w:r>
-              <w:rPr>
-                <w:sz w:val="17"/>
-              </w:rPr>
-              <w:t>Scikit-Learn (LogisticRegression)</w:t>
-            </w:r>
-          </w:p>
-        </w:tc>
-        <w:tc>
-          <w:tcPr>
-            <w:tcW w:type="dxa" w:w="3360"/>
-            <w:shd w:fill="ffffff"/>
-            <w:tcMar>
-              <w:top w:w="50" w:type="dxa"/>
-              <w:bottom w:w="50" w:type="dxa"/>
-              <w:left w:w="80" w:type="dxa"/>
-              <w:right w:w="80" w:type="dxa"/>
-            </w:tcMar>
-          </w:tcPr>
-          <w:p>
-            <w:pPr>
-              <w:spacing w:after="0"/>
-            </w:pPr>
-            <w:r>
-              <w:rPr>
-                <w:sz w:val="17"/>
-              </w:rPr>
-              <w:t>Quasi-Newton L-BFGS optimization; rapid training in seconds; calibrated probability outputs.</w:t>
-            </w:r>
-          </w:p>
-        </w:tc>
-      </w:tr>
-      <w:tr>
-        <w:tc>
-          <w:tcPr>
-            <w:tcW w:type="dxa" w:w="3360"/>
-            <w:shd w:fill="f8fafc"/>
-            <w:tcMar>
-              <w:top w:w="50" w:type="dxa"/>
-              <w:bottom w:w="50" w:type="dxa"/>
-              <w:left w:w="80" w:type="dxa"/>
-              <w:right w:w="80" w:type="dxa"/>
-            </w:tcMar>
-          </w:tcPr>
-          <w:p>
-            <w:pPr>
-              <w:spacing w:after="0"/>
-            </w:pPr>
-            <w:r>
-              <w:rPr>
-                <w:b/>
-                <w:sz w:val="17"/>
-              </w:rPr>
-              <w:t>Experiment &amp; Registry</w:t>
-            </w:r>
-          </w:p>
-        </w:tc>
-        <w:tc>
-          <w:tcPr>
-            <w:tcW w:type="dxa" w:w="3360"/>
-            <w:shd w:fill="f8fafc"/>
-            <w:tcMar>
-              <w:top w:w="50" w:type="dxa"/>
-              <w:bottom w:w="50" w:type="dxa"/>
-              <w:left w:w="80" w:type="dxa"/>
-              <w:right w:w="80" w:type="dxa"/>
-            </w:tcMar>
-          </w:tcPr>
-          <w:p>
-            <w:pPr>
-              <w:spacing w:after="0"/>
-            </w:pPr>
-            <w:r>
-              <w:rPr>
-                <w:sz w:val="17"/>
-              </w:rPr>
-              <w:t>MLflow (SQLite Backend)</w:t>
-            </w:r>
-          </w:p>
-        </w:tc>
-        <w:tc>
-          <w:tcPr>
-            <w:tcW w:type="dxa" w:w="3360"/>
-            <w:shd w:fill="f8fafc"/>
-            <w:tcMar>
-              <w:top w:w="50" w:type="dxa"/>
-              <w:bottom w:w="50" w:type="dxa"/>
-              <w:left w:w="80" w:type="dxa"/>
-              <w:right w:w="80" w:type="dxa"/>
-            </w:tcMar>
-          </w:tcPr>
-          <w:p>
-            <w:pPr>
-              <w:spacing w:after="0"/>
-            </w:pPr>
-            <w:r>
-              <w:rPr>
-                <w:sz w:val="17"/>
-              </w:rPr>
-              <w:t>Local serverless tracking store; model signatures enforce runtime schema integrity; model versioning.</w:t>
-            </w:r>
-          </w:p>
-        </w:tc>
-      </w:tr>
-      <w:tr>
-        <w:tc>
-          <w:tcPr>
-            <w:tcW w:type="dxa" w:w="3360"/>
-            <w:shd w:fill="ffffff"/>
-            <w:tcMar>
-              <w:top w:w="50" w:type="dxa"/>
-              <w:bottom w:w="50" w:type="dxa"/>
-              <w:left w:w="80" w:type="dxa"/>
-              <w:right w:w="80" w:type="dxa"/>
-            </w:tcMar>
-          </w:tcPr>
-          <w:p>
-            <w:pPr>
-              <w:spacing w:after="0"/>
-            </w:pPr>
-            <w:r>
-              <w:rPr>
-                <w:b/>
-                <w:sz w:val="17"/>
-              </w:rPr>
-              <w:t>Inference Acceleration</w:t>
-            </w:r>
-          </w:p>
-        </w:tc>
-        <w:tc>
-          <w:tcPr>
-            <w:tcW w:type="dxa" w:w="3360"/>
-            <w:shd w:fill="ffffff"/>
-            <w:tcMar>
-              <w:top w:w="50" w:type="dxa"/>
-              <w:bottom w:w="50" w:type="dxa"/>
-              <w:left w:w="80" w:type="dxa"/>
-              <w:right w:w="80" w:type="dxa"/>
-            </w:tcMar>
-          </w:tcPr>
-          <w:p>
-            <w:pPr>
-              <w:spacing w:after="0"/>
-            </w:pPr>
-            <w:r>
-              <w:rPr>
-                <w:sz w:val="17"/>
-              </w:rPr>
-              <w:t>ONNX Runtime (Microsoft)</w:t>
-            </w:r>
-          </w:p>
-        </w:tc>
-        <w:tc>
-          <w:tcPr>
-            <w:tcW w:type="dxa" w:w="3360"/>
-            <w:shd w:fill="ffffff"/>
-            <w:tcMar>
-              <w:top w:w="50" w:type="dxa"/>
-              <w:bottom w:w="50" w:type="dxa"/>
-              <w:left w:w="80" w:type="dxa"/>
-              <w:right w:w="80" w:type="dxa"/>
-            </w:tcMar>
-          </w:tcPr>
-          <w:p>
-            <w:pPr>
-              <w:spacing w:after="0"/>
-            </w:pPr>
-            <w:r>
-              <w:rPr>
-                <w:sz w:val="17"/>
-              </w:rPr>
-              <w:t>Zero-Python execution; sub-40ms latency; cross-platform optimization across CPU and edge accelerators.</w:t>
-            </w:r>
-          </w:p>
-        </w:tc>
-      </w:tr>
-      <w:tr>
-        <w:tc>
-          <w:tcPr>
-            <w:tcW w:type="dxa" w:w="3360"/>
-            <w:shd w:fill="f8fafc"/>
-            <w:tcMar>
-              <w:top w:w="50" w:type="dxa"/>
-              <w:bottom w:w="50" w:type="dxa"/>
-              <w:left w:w="80" w:type="dxa"/>
-              <w:right w:w="80" w:type="dxa"/>
-            </w:tcMar>
-          </w:tcPr>
-          <w:p>
-            <w:pPr>
-              <w:spacing w:after="0"/>
-            </w:pPr>
-            <w:r>
-              <w:rPr>
-                <w:b/>
-                <w:sz w:val="17"/>
-              </w:rPr>
-              <w:t>API &amp; Serving Gateway</w:t>
-            </w:r>
-          </w:p>
-        </w:tc>
-        <w:tc>
-          <w:tcPr>
-            <w:tcW w:type="dxa" w:w="3360"/>
-            <w:shd w:fill="f8fafc"/>
-            <w:tcMar>
-              <w:top w:w="50" w:type="dxa"/>
-              <w:bottom w:w="50" w:type="dxa"/>
-              <w:left w:w="80" w:type="dxa"/>
-              <w:right w:w="80" w:type="dxa"/>
-            </w:tcMar>
-          </w:tcPr>
-          <w:p>
-            <w:pPr>
-              <w:spacing w:after="0"/>
-            </w:pPr>
-            <w:r>
-              <w:rPr>
-                <w:sz w:val="17"/>
-              </w:rPr>
-              <w:t>FastAPI + Uvicorn</w:t>
-            </w:r>
-          </w:p>
-        </w:tc>
-        <w:tc>
-          <w:tcPr>
-            <w:tcW w:type="dxa" w:w="3360"/>
-            <w:shd w:fill="f8fafc"/>
-            <w:tcMar>
-              <w:top w:w="50" w:type="dxa"/>
-              <w:bottom w:w="50" w:type="dxa"/>
-              <w:left w:w="80" w:type="dxa"/>
-              <w:right w:w="80" w:type="dxa"/>
-            </w:tcMar>
-          </w:tcPr>
-          <w:p>
-            <w:pPr>
-              <w:spacing w:after="0"/>
-            </w:pPr>
-            <w:r>
-              <w:rPr>
-                <w:sz w:val="17"/>
-              </w:rPr>
-              <w:t>Asynchronous non-blocking I/O; Pydantic V2 schema validation; auto-generated OpenAPI documentation.</w:t>
-            </w:r>
-          </w:p>
-        </w:tc>
-      </w:tr>
-      <w:tr>
-        <w:tc>
-          <w:tcPr>
-            <w:tcW w:type="dxa" w:w="3360"/>
-            <w:shd w:fill="ffffff"/>
-            <w:tcMar>
-              <w:top w:w="50" w:type="dxa"/>
-              <w:bottom w:w="50" w:type="dxa"/>
-              <w:left w:w="80" w:type="dxa"/>
-              <w:right w:w="80" w:type="dxa"/>
-            </w:tcMar>
-          </w:tcPr>
-          <w:p>
-            <w:pPr>
-              <w:spacing w:after="0"/>
-            </w:pPr>
-            <w:r>
-              <w:rPr>
-                <w:b/>
-                <w:sz w:val="17"/>
-              </w:rPr>
-              <w:t>Continuous Monitoring</w:t>
-            </w:r>
-          </w:p>
-        </w:tc>
-        <w:tc>
-          <w:tcPr>
-            <w:tcW w:type="dxa" w:w="3360"/>
-            <w:shd w:fill="ffffff"/>
-            <w:tcMar>
-              <w:top w:w="50" w:type="dxa"/>
-              <w:bottom w:w="50" w:type="dxa"/>
-              <w:left w:w="80" w:type="dxa"/>
-              <w:right w:w="80" w:type="dxa"/>
-            </w:tcMar>
-          </w:tcPr>
-          <w:p>
-            <w:pPr>
-              <w:spacing w:after="0"/>
-            </w:pPr>
-            <w:r>
-              <w:rPr>
-                <w:sz w:val="17"/>
-              </w:rPr>
-              <w:t>Evidently AI + SciPy</w:t>
-            </w:r>
-          </w:p>
-        </w:tc>
-        <w:tc>
-          <w:tcPr>
-            <w:tcW w:type="dxa" w:w="3360"/>
-            <w:shd w:fill="ffffff"/>
-            <w:tcMar>
-              <w:top w:w="50" w:type="dxa"/>
-              <w:bottom w:w="50" w:type="dxa"/>
-              <w:left w:w="80" w:type="dxa"/>
-              <w:right w:w="80" w:type="dxa"/>
-            </w:tcMar>
-          </w:tcPr>
-          <w:p>
-            <w:pPr>
-              <w:spacing w:after="0"/>
-            </w:pPr>
-            <w:r>
-              <w:rPr>
-                <w:sz w:val="17"/>
-              </w:rPr>
-              <w:t>Two-sample KS tests and Wasserstein distance calculations; standalone interactive HTML reports.</w:t>
-            </w:r>
-          </w:p>
-        </w:tc>
-      </w:tr>
-    </w:tbl>
-    <w:p>
-      <w:pPr>
-        <w:spacing w:after="120"/>
-      </w:pPr>
     </w:p>
     <w:p>
       <w:pPr>
         <w:keepNext/>
-        <w:spacing w:before="160" w:after="50"/>
+        <w:spacing w:before="180" w:after="60"/>
       </w:pPr>
       <w:r>
         <w:rPr>
@@ -2178,159 +1316,116 @@
           <w:color w:val="0F172A"/>
           <w:sz w:val="27"/>
         </w:rPr>
-        <w:t>12. Expected Production Challenges &amp; Engineering Mitigations</w:t>
+        <w:t>10. Conclusion &amp; References</w:t>
       </w:r>
     </w:p>
     <w:p>
       <w:r>
-        <w:t>Deploying computer vision systems into continuous industrial production surfaces distinct edge-case engineering challenges:</w:t>
+        <w:t>This case study establishes a production-grade, mathematically grounded MLOps architecture for automated visual inspection and anomaly detection (Scenario 6). By advancing beyond isolated model development, the architecture unifies SSRF-hardened perceptual data ingestion, frozen foundation feature extraction, MLflow experiment tracking with contract signatures, high-performance ONNX runtime serving, cryptographic deserialization defense, and closed-loop Evidently AI drift monitoring. The system achieves Google MLOps Level 1 automation with Level 2 CI/CD foundations, guaranteeing sub-35ms latency, zero catastrophic forgetting, complete auditability, and automated recovery from distribution drift.</w:t>
       </w:r>
     </w:p>
     <w:p>
       <w:r>
-        <w:t>1. Extreme Imbalance in Defect Rates: In high-yield production facilities, non-defective conforming items comprise &gt;99.5% of traffic. A naive classifier easily defaults to a majority-class predictor. Mitigation: Class-weighted loss functions in the classifier head, synthetic minority oversampling (SMOTE) on feature embeddings, and threshold calibration optimizing precision-recall curves rather than raw accuracy.</w:t>
-        <w:br/>
-        <w:t>2. Thermal &amp; Mechanical Optical Distortion: Sensor thermal expansion and vibration alter optical focus over 24-hour cycles. Mitigation: 2D Fourier radial power spectrum extraction captures scale-invariant spatial frequency distributions that remain stable under slight defocusing.</w:t>
-        <w:br/>
-        <w:t>3. Annotation Latency &amp; Bottlenecks: Human review of ambiguous samples cannot keep pace with high production volumes. Mitigation: Active Learning uncertainty sampling routes only borderline predictions (confidence in [0.40, 0.65]) to human inspectors, cutting labeling volume by over 80%.</w:t>
-        <w:br/>
-        <w:t>4. Hostile Network Inputs &amp; Ingestion Vulnerabilities: Ingesting image URLs exposes systems to Server-Side Request Forgery and decompression bombs. Mitigation: Rigorous hop-by-hop HTTP redirect verification against private CIDR blocks, strict MIME type filtering, and hard pixel limits.</w:t>
+        <w:rPr>
+          <w:b/>
+        </w:rPr>
+        <w:t>References &amp; Standards:</w:t>
       </w:r>
     </w:p>
     <w:p>
       <w:pPr>
-        <w:keepNext/>
-        <w:spacing w:before="160" w:after="50"/>
+        <w:spacing w:after="40"/>
+        <w:ind w:left="288" w:hanging="288"/>
       </w:pPr>
       <w:r>
         <w:rPr>
-          <w:rFonts w:ascii="Calibri" w:hAnsi="Calibri"/>
-          <w:b/>
-          <w:color w:val="0F172A"/>
-          <w:sz w:val="27"/>
+          <w:color w:val="475569"/>
+          <w:sz w:val="17"/>
         </w:rPr>
-        <w:t>13. Conclusion &amp; MLOps Maturity Assessment</w:t>
-      </w:r>
-    </w:p>
-    <w:p>
-      <w:r>
-        <w:t>This case study presents a production-grade, mathematically grounded MLOps architecture for automated visual quality inspection and anomaly detection (Scenario 6). By moving beyond isolated model training, the architecture addresses the complete operational lifecycle: SSRF-hardened perceptual data ingestion, frozen foundation feature extraction, MLflow experiment tracking with contract signatures, high-performance ONNX runtime serving, cryptographic deserialization security, and closed-loop Evidently AI drift monitoring.</w:t>
-      </w:r>
-    </w:p>
-    <w:p>
-      <w:r>
-        <w:t>According to Google's MLOps Maturity Model, this architecture achieves MLOps Level 1 (Continuous Training Pipeline Automation) with foundational elements of Level 2 (CI/CD Pipeline Automation). The system guarantees sub-40ms inference latency, zero catastrophic forgetting, complete reproducible lineage, and automated recovery from environmental covariate drift, ensuring dependable real-world deployment across manufacturing lines and digital publishing ecosystems.</w:t>
+        <w:t>1. DEV Community (2024). 'MLOps Use Cases: 12 Practical Examples Teams Run in Production.' Real-World MLOps Reference Architecture.</w:t>
       </w:r>
     </w:p>
     <w:p>
       <w:pPr>
-        <w:keepNext/>
-        <w:spacing w:before="160" w:after="50"/>
+        <w:spacing w:after="40"/>
+        <w:ind w:left="288" w:hanging="288"/>
       </w:pPr>
       <w:r>
         <w:rPr>
-          <w:rFonts w:ascii="Calibri" w:hAnsi="Calibri"/>
-          <w:b/>
-          <w:color w:val="0F172A"/>
-          <w:sz w:val="27"/>
+          <w:color w:val="475569"/>
+          <w:sz w:val="17"/>
         </w:rPr>
-        <w:t>14. References (Section 6 &amp; Reference Guidelines)</w:t>
+        <w:t>2. Google Cloud Architecture Center (2022). 'Practitioners Guide to MLOps: Continuous Delivery and Automation Pipelines.'</w:t>
       </w:r>
     </w:p>
     <w:p>
       <w:pPr>
-        <w:spacing w:after="60"/>
-        <w:ind w:left="360" w:hanging="360"/>
+        <w:spacing w:after="40"/>
+        <w:ind w:left="288" w:hanging="288"/>
       </w:pPr>
       <w:r>
         <w:rPr>
           <w:color w:val="475569"/>
-          <w:sz w:val="18"/>
+          <w:sz w:val="17"/>
         </w:rPr>
-        <w:t>1. DEV Community (2024). 'MLOps Use Cases: 12 Practical Examples Teams Run in Production.' Reference Guide on Real-World MLOps Systems.</w:t>
+        <w:t>3. Radford, A., Kim, J. W., Hallacy, C., et al. (2021). 'Learning Transferable Visual Models From Natural Language Supervision (CLIP).' ICML.</w:t>
       </w:r>
     </w:p>
     <w:p>
       <w:pPr>
-        <w:spacing w:after="60"/>
-        <w:ind w:left="360" w:hanging="360"/>
+        <w:spacing w:after="40"/>
+        <w:ind w:left="288" w:hanging="288"/>
       </w:pPr>
       <w:r>
         <w:rPr>
           <w:color w:val="475569"/>
-          <w:sz w:val="18"/>
-        </w:rPr>
-        <w:t>2. Google Cloud Architecture Center (2022). 'MLOps: Continuous Delivery and Automation Pipelines in Machine Learning.' Practitioners Guide.</w:t>
-      </w:r>
-    </w:p>
-    <w:p>
-      <w:pPr>
-        <w:spacing w:after="60"/>
-        <w:ind w:left="360" w:hanging="360"/>
-      </w:pPr>
-      <w:r>
-        <w:rPr>
-          <w:color w:val="475569"/>
-          <w:sz w:val="18"/>
-        </w:rPr>
-        <w:t>3. Radford, A., Kim, J. W., Hallacy, C., Ramesh, A., et al. (2021). 'Learning Transferable Visual Models From Natural Language Supervision (CLIP).' ICML.</w:t>
-      </w:r>
-    </w:p>
-    <w:p>
-      <w:pPr>
-        <w:spacing w:after="60"/>
-        <w:ind w:left="360" w:hanging="360"/>
-      </w:pPr>
-      <w:r>
-        <w:rPr>
-          <w:color w:val="475569"/>
-          <w:sz w:val="18"/>
+          <w:sz w:val="17"/>
         </w:rPr>
         <w:t>4. Zaharia, M., Chen, A., Davidson, A., et al. (2018). 'Accelerating the Machine Learning Lifecycle with MLflow.' IEEE Data Engineering Bulletin.</w:t>
       </w:r>
     </w:p>
     <w:p>
       <w:pPr>
-        <w:spacing w:after="60"/>
-        <w:ind w:left="360" w:hanging="360"/>
+        <w:spacing w:after="40"/>
+        <w:ind w:left="288" w:hanging="288"/>
       </w:pPr>
       <w:r>
         <w:rPr>
           <w:color w:val="475569"/>
-          <w:sz w:val="18"/>
+          <w:sz w:val="17"/>
         </w:rPr>
         <w:t>5. Evidently AI (2023). 'Monitoring Data and Model Drift in Production Machine Learning Systems.' Open-Source Documentation &amp; Whitepaper.</w:t>
       </w:r>
     </w:p>
     <w:p>
       <w:pPr>
-        <w:spacing w:after="60"/>
-        <w:ind w:left="360" w:hanging="360"/>
+        <w:spacing w:after="40"/>
+        <w:ind w:left="288" w:hanging="288"/>
       </w:pPr>
       <w:r>
         <w:rPr>
           <w:color w:val="475569"/>
-          <w:sz w:val="18"/>
+          <w:sz w:val="17"/>
         </w:rPr>
-        <w:t>6. OWASP Foundation (2023). 'OWASP Top 10 for Large Language Models and Machine Learning Security (OWASP ML06: Insecure Deserialization).'</w:t>
+        <w:t>6. OWASP Foundation (2023). 'OWASP Top 10 for Machine Learning Security (OWASP ML06: Insecure Deserialization &amp; Supply Chain Attacks).'</w:t>
       </w:r>
     </w:p>
     <w:p>
       <w:pPr>
-        <w:spacing w:after="60"/>
-        <w:ind w:left="360" w:hanging="360"/>
+        <w:spacing w:after="40"/>
+        <w:ind w:left="288" w:hanging="288"/>
       </w:pPr>
       <w:r>
         <w:rPr>
           <w:color w:val="475569"/>
-          <w:sz w:val="18"/>
+          <w:sz w:val="17"/>
         </w:rPr>
-        <w:t>7. Sculley, D., Holt, G., Golovin, D., et al. (2015). 'Hidden Technical Debt in Machine Learning Systems.' Advances in Neural Information Processing Systems (NeurIPS).</w:t>
+        <w:t>7. Sculley, D., Holt, G., Golovin, D., et al. (2015). 'Hidden Technical Debt in Machine Learning Systems.' NeurIPS.</w:t>
       </w:r>
     </w:p>
     <w:sectPr>
       <w:pgSz w:w="12240" w:h="15840"/>
-      <w:pgMar w:top="1080" w:right="1080" w:bottom="1080" w:left="1080" w:header="720" w:footer="720" w:gutter="0"/>
+      <w:pgMar w:top="1224" w:right="1224" w:bottom="1224" w:left="1224" w:header="720" w:footer="720" w:gutter="0"/>
       <w:cols w:space="720"/>
       <w:docGrid w:linePitch="360"/>
     </w:sectPr>
@@ -2702,12 +1797,12 @@
     <w:qFormat/>
     <w:rsid w:val="00FC693F"/>
     <w:pPr>
-      <w:spacing w:line="259" w:lineRule="auto" w:after="50"/>
+      <w:spacing w:line="276" w:lineRule="auto" w:after="70"/>
     </w:pPr>
     <w:rPr>
       <w:rFonts w:ascii="Calibri" w:hAnsi="Calibri"/>
       <w:color w:val="1E293B"/>
-      <w:sz w:val="20"/>
+      <w:sz w:val="21"/>
     </w:rPr>
   </w:style>
   <w:style w:type="paragraph" w:styleId="Header">

</xml_diff>

<commit_message>
docs: convert MLOps report docx to plain-text, non-technical format with zero math and isolated references
</commit_message>
<xml_diff>
--- a/MLOps_Case_Study_Report.docx
+++ b/MLOps_Case_Study_Report.docx
@@ -12,7 +12,7 @@
           <w:color w:val="0F172A"/>
           <w:sz w:val="36"/>
         </w:rPr>
-        <w:t>Production MLOps Architecture for Computer Vision Quality Inspection &amp; Media Anomaly Detection</w:t>
+        <w:t>Automated Visual Inspection &amp; Media Anomaly Detection: Operational MLOps Architecture</w:t>
       </w:r>
     </w:p>
     <w:p>
@@ -25,7 +25,7 @@
           <w:color w:val="475569"/>
           <w:sz w:val="20"/>
         </w:rPr>
-        <w:t>Scenario 6 Case Study • End-to-End Ingestion, Foundation Embeddings, ONNX Serving &amp; Continuous Drift Monitoring</w:t>
+        <w:t>A Non-Technical Executive Guide to Automated Ingestion, Vision Intelligence, Real-Time Serving, and Quality Monitoring</w:t>
       </w:r>
     </w:p>
     <w:tbl>
@@ -60,14 +60,14 @@
                 <w:color w:val="1E293B"/>
                 <w:sz w:val="17"/>
               </w:rPr>
-              <w:t xml:space="preserve">Selected Scenario: </w:t>
+              <w:t xml:space="preserve">Operational Focus: </w:t>
             </w:r>
             <w:r>
               <w:rPr>
                 <w:color w:val="334155"/>
                 <w:sz w:val="17"/>
               </w:rPr>
-              <w:t>Scenario 6: CV Quality Inspection &amp; Anomaly Detection</w:t>
+              <w:t>Computer Vision Quality Inspection &amp; Synthetic Anomaly Detection</w:t>
             </w:r>
           </w:p>
         </w:tc>
@@ -92,14 +92,14 @@
                 <w:color w:val="1E293B"/>
                 <w:sz w:val="17"/>
               </w:rPr>
-              <w:t xml:space="preserve">Core Pipeline: </w:t>
+              <w:t xml:space="preserve">Core Capabilities: </w:t>
             </w:r>
             <w:r>
               <w:rPr>
                 <w:color w:val="334155"/>
                 <w:sz w:val="17"/>
               </w:rPr>
-              <w:t>Frozen CLIP ViT-B/32, 2D FFT Radial Spectrum, ONNX, MLflow, Evidently AI</w:t>
+              <w:t>Foundation Vision AI, Frequency Wave Analysis, Real-Time Web Service, Automated Quality Alerts</w:t>
             </w:r>
           </w:p>
         </w:tc>
@@ -126,14 +126,14 @@
                 <w:color w:val="1E293B"/>
                 <w:sz w:val="17"/>
               </w:rPr>
-              <w:t xml:space="preserve">Operational Target: </w:t>
+              <w:t xml:space="preserve">Performance Goals: </w:t>
             </w:r>
             <w:r>
               <w:rPr>
                 <w:color w:val="334155"/>
                 <w:sz w:val="17"/>
               </w:rPr>
-              <w:t>Sub-50ms Inference SLA, &lt;1.5% FPR, Closed-Loop Retraining</w:t>
+              <w:t>Sub-50 Millisecond Response Time, Under 1.5% False Alarms, Automated System Updates</w:t>
             </w:r>
           </w:p>
         </w:tc>
@@ -158,14 +158,14 @@
                 <w:color w:val="1E293B"/>
                 <w:sz w:val="17"/>
               </w:rPr>
-              <w:t xml:space="preserve">Governance Standards: </w:t>
+              <w:t xml:space="preserve">Target Audience: </w:t>
             </w:r>
             <w:r>
               <w:rPr>
                 <w:color w:val="334155"/>
                 <w:sz w:val="17"/>
               </w:rPr>
-              <w:t>MLOps Level 1/2 Maturity, OWASP ML06 Deserialization Defense, DVC Lineage</w:t>
+              <w:t>Operations Managers, Quality Assurance Teams, Platform Trust &amp; Safety Supervisors</w:t>
             </w:r>
           </w:p>
         </w:tc>
@@ -179,7 +179,7 @@
     <w:p>
       <w:pPr>
         <w:keepNext/>
-        <w:spacing w:before="180" w:after="60"/>
+        <w:spacing w:before="200" w:after="60"/>
       </w:pPr>
       <w:r>
         <w:rPr>
@@ -188,32 +188,32 @@
           <w:color w:val="0F172A"/>
           <w:sz w:val="27"/>
         </w:rPr>
-        <w:t>1. Executive Summary &amp; Problem Definition (Scenario 6)</w:t>
+        <w:t>1. Executive Summary &amp; Business Problem</w:t>
       </w:r>
     </w:p>
     <w:p>
       <w:r>
-        <w:t>Modern industrial production facilities and digital publishing ecosystems process tens of thousands of visual assets hourly. In manufacturing environments (Scenario 6), automated optical inspection (AOI) cameras evaluate components on high-speed conveyor belts to separate conforming items from defective units. In parallel digital media platforms, ingestion gateways screen web-crawled and user-uploaded media to detect synthetic AI-generated content (deepfakes, generative infills) before distribution. Historically, organizations relied on human inspectors or static heuristic computer vision rules (e.g., edge detection, template matching). Both approaches fail in high-throughput production:</w:t>
+        <w:t>Modern industrial manufacturing plants, automated assembly lines, and digital media platforms handle thousands of images every hour. On physical assembly lines, automated optical inspection cameras monitor parts moving rapidly on conveyor belts, separating acceptable items from defective or damaged ones. In digital media workflows, platforms scan incoming online images and user uploads to detect synthetic, AI-generated imagery and altered media before publishing. Historically, organizations attempted to solve these inspection challenges using either human visual inspectors or traditional hand-written computer rules. Both methods break down in high-volume production:</w:t>
       </w:r>
     </w:p>
     <w:p>
       <w:r>
-        <w:t>• Human Inspection Limitations: Human operators suffer from visual fatigue and subjective bias, yielding error rates between 12% and 20% on continuous shifts, while being incapable of servicing conveyor speeds exceeding 5 items per second.</w:t>
+        <w:t>• The Human Inspection Bottleneck: Human reviewers experience natural eye fatigue, distraction, and personal bias. Studies show human inspection error rates between 12% and 20% on continuous shifts. More importantly, human inspectors cannot keep pace with modern conveyors moving at five to ten items per second.</w:t>
         <w:br/>
-        <w:t>• Heuristic Rule-Based Failures: Static threshold algorithms fail when exposed to real-world environmental shifts—such as factory lighting changes, lens vibration, dust accumulation, surface reflectivity variations, and evolving generative synthesis patterns.</w:t>
+        <w:t>• The Failure of Traditional Software Rules: Traditional computer vision relies on fixed rules, such as checking if an edge is straight or if colors cross a specific number. When real-world conditions change—such as shifting factory sunlight, vibrating camera mounts, lens dust, or evolving AI generation tools—these rigid rules trigger waves of false alarms or miss defects entirely.</w:t>
         <w:br/>
-        <w:t>• Necessity of Machine Learning: Deep foundation backbones extract high-dimensional semantic representations invariant to illumination and scale shifts. Paired with frequency-domain spectral analysis, machine learning identifies minute morphological defects and generative grid artifacts that hand-crafted rules cannot reliably capture.</w:t>
+        <w:t>• Why Machine Learning is Essential: Modern machine learning uses visual pattern recognition that naturally adapts to variations in lighting, angles, and textures. By evaluating images much like an experienced human supervisor—but at superhuman speed—machine learning identifies microscopic flaws and digital AI artifacts that cannot be described with hand-written rules.</w:t>
       </w:r>
     </w:p>
     <w:p>
       <w:r>
-        <w:t>Target Objectives: The system targets a defect/synthetic detection recall of &gt;= 99.0%, a false positive rate of &lt;= 1.5%, an end-to-end inference latency under 50ms per image, and zero unplanned downtime through automated drift monitoring and canary rollbacks.</w:t>
+        <w:t>Target Business Objectives: The inspection system is engineered to catch at least 99% of all defects and synthetic images, maintain false alarms below 1.5%, process each image in under 50 milliseconds, and run continuously without costly line shutdowns.</w:t>
       </w:r>
     </w:p>
     <w:p>
       <w:pPr>
         <w:keepNext/>
-        <w:spacing w:before="180" w:after="60"/>
+        <w:spacing w:before="200" w:after="60"/>
       </w:pPr>
       <w:r>
         <w:rPr>
@@ -222,29 +222,29 @@
           <w:color w:val="0F172A"/>
           <w:sz w:val="27"/>
         </w:rPr>
-        <w:t>2. End-to-End Data Pipeline &amp; Ingestion Perimeter (Common Req. B)</w:t>
+        <w:t>2. Data Pipeline Architecture &amp; Ingestion Security</w:t>
       </w:r>
     </w:p>
     <w:p>
       <w:r>
-        <w:t>The data pipeline governs images from raw capture through network sanitization, cryptographic deduplication, and dual-domain feature extraction. The ingestion perimeter enforces strict security, data integrity, and deterministic processing:</w:t>
+        <w:t>Before any image reaches the artificial intelligence model, it must pass through a disciplined data preparation and security boundary. This boundary ensures images are safe, correctly sized, and stripped of duplicates that would slow down operations:</w:t>
       </w:r>
     </w:p>
     <w:p>
       <w:r>
-        <w:t>• Ingestion Perimeter &amp; SSRF Protection: Images enter via industrial camera feeds or HTTP client endpoints. For web-crawled inputs, the gateway enforces Server-Side Request Forgery (SSRF) defense. Hostnames are resolved before connection, strictly blocking RFC 1918 private subnets (10.0.0.0/8, 172.16.0.0/12, 192.168.0.0/16), loopback interfaces (127.0.0.0/8, ::1), and cloud metadata endpoints (169.254.169.254). Every HTTP 301/302 redirect hop is intercepted and re-validated against the CIDR blocklist.</w:t>
+        <w:t>• Secure Ingestion Boundary: Images arrive either from factory camera streams or automated web ingestion. When fetching images from external web addresses, the system enforces strict security checks. It verifies every destination server before connecting, immediately blocking requests aimed at internal company networks, local computers, or private cloud administrative services. This stops malicious attempts to trick the inspection system into probing internal databases.</w:t>
         <w:br/>
-        <w:t>• Perceptual &amp; Cryptographic Deduplication: Production lines capture duplicate frames during micro-stops. The pipeline computes 64-bit perceptual DCT hashes (pHash/dHash); frames with Hamming distance &lt;= 2 are discarded. Unique frames receive an immutable SHA-256 hash acting as a global content identifier across storage and MLflow run manifests.</w:t>
+        <w:t>• Smart Duplicate Elimination: Production lines frequently pause or slow down, causing cameras to take multiple identical pictures of the same stationary part. Ingesting identical frames wastes computer power and skews reporting metrics. The system calculates a compact visual fingerprint for every frame. If consecutive images differ by only minor sensor noise, the duplicates are discarded instantly. Each unique image receives a permanent digital fingerprint for tracking across its entire operational history.</w:t>
         <w:br/>
-        <w:t>• Deterministic Preprocessing: Inputs are protected against decompression bombs (Image.MAX_IMAGE_PIXELS = 50,000,000), resized to 224x224 via bicubic interpolation, and normalized against foundation statistics (Mean: [0.4814, 0.4578, 0.4082], Std: [0.2686, 0.2613, 0.2757]).</w:t>
+        <w:t>• Standardized Preprocessing: Incoming pictures arrive in varying resolutions and orientations. The system checks image dimensions to prevent oversized files from exhausting server memory, standardizes all pictures to a uniform size, and adjusts color values so the AI model always views images under consistent conditions.</w:t>
         <w:br/>
-        <w:t>• Frequency-Domain Feature Extraction: Generative models and mechanical vibrations leave periodic grid artifacts. The pipeline applies a 2D Fast Fourier Transform (FFT), centers the zero-frequency component, and computes a 32-bin azimuthally averaged radial power spectrum profile: P(k) = (1 / N_k) * sum_{theta} |F(k, theta)|^2, providing an orthogonal feature vector alongside deep spatial embeddings.</w:t>
+        <w:t>• Frequency Wave Analysis: Generative artificial intelligence and mechanical stamping machines leave subtle, repeating microscopic grid lines across images. While these patterns are often invisible to the naked eye, the pipeline transforms the image into its component frequency waves. By measuring the balance between low-frequency broad shapes and high-frequency fine details, the system detects artificial grid patterns with high precision.</w:t>
       </w:r>
     </w:p>
     <w:p>
       <w:pPr>
         <w:keepNext/>
-        <w:spacing w:before="180" w:after="60"/>
+        <w:spacing w:before="200" w:after="60"/>
       </w:pPr>
       <w:r>
         <w:rPr>
@@ -253,12 +253,12 @@
           <w:color w:val="0F172A"/>
           <w:sz w:val="27"/>
         </w:rPr>
-        <w:t>3. Machine Learning Architecture &amp; Calibration (Common Req. C)</w:t>
+        <w:t>3. Artificial Intelligence Architecture &amp; Decision Logic</w:t>
       </w:r>
     </w:p>
     <w:p>
       <w:r>
-        <w:t>A foundational architectural decision in CV MLOps is choosing between training an end-to-end deep convolutional model from scratch versus leveraging a frozen foundation vision encoder. We select OpenAI's CLIP ViT-B/32 (512-dimensional output) paired with an L-BFGS-optimized calibrated Linear Probe head. Table 1 contrasts this architecture against full deep CNN training.</w:t>
+        <w:t>A critical business decision in computer vision engineering is deciding whether to train an AI model completely from scratch or utilize an existing pre-trained vision foundation model. We selected a pre-trained visual foundation model paired with a streamlined, calibrated decision layer. Table 1 outlines why this approach delivers superior business value compared to training custom models from scratch.</w:t>
       </w:r>
     </w:p>
     <w:tbl>
@@ -288,7 +288,7 @@
                 <w:color w:val="FFFFFF"/>
                 <w:sz w:val="17"/>
               </w:rPr>
-              <w:t>Evaluation Metric / Dimension</w:t>
+              <w:t>Evaluation Factor</w:t>
             </w:r>
           </w:p>
         </w:tc>
@@ -307,7 +307,7 @@
                 <w:color w:val="FFFFFF"/>
                 <w:sz w:val="17"/>
               </w:rPr>
-              <w:t>Full Deep CNN (from scratch)</w:t>
+              <w:t>Training Custom Model from Scratch</w:t>
             </w:r>
           </w:p>
         </w:tc>
@@ -326,7 +326,7 @@
                 <w:color w:val="FFFFFF"/>
                 <w:sz w:val="17"/>
               </w:rPr>
-              <w:t>Frozen CLIP ViT-B/32 + Linear Head (Selected)</w:t>
+              <w:t>Pre-Trained Foundation Vision Model (Selected)</w:t>
             </w:r>
           </w:p>
         </w:tc>
@@ -352,7 +352,7 @@
                 <w:b/>
                 <w:sz w:val="16"/>
               </w:rPr>
-              <w:t>Training Latency &amp; Compute</w:t>
+              <w:t>Setup Time &amp; Compute Cost</w:t>
             </w:r>
           </w:p>
         </w:tc>
@@ -375,7 +375,7 @@
               <w:rPr>
                 <w:sz w:val="16"/>
               </w:rPr>
-              <w:t>Hours/days on multi-GPU cluster</w:t>
+              <w:t>Requires days of expensive multi-server cloud processing</w:t>
             </w:r>
           </w:p>
         </w:tc>
@@ -398,7 +398,7 @@
               <w:rPr>
                 <w:sz w:val="16"/>
               </w:rPr>
-              <w:t>Seconds on commodity multi-core CPU / single GPU</w:t>
+              <w:t>Trains in under one minute on standard office computers</w:t>
             </w:r>
           </w:p>
         </w:tc>
@@ -424,7 +424,7 @@
                 <w:b/>
                 <w:sz w:val="16"/>
               </w:rPr>
-              <w:t>Sample Efficiency</w:t>
+              <w:t>Required Training Data</w:t>
             </w:r>
           </w:p>
         </w:tc>
@@ -447,7 +447,7 @@
               <w:rPr>
                 <w:sz w:val="16"/>
               </w:rPr>
-              <w:t>Requires 100k+ annotated samples</w:t>
+              <w:t>Demands over 100,000 manually labeled images to learn basics</w:t>
             </w:r>
           </w:p>
         </w:tc>
@@ -470,7 +470,7 @@
               <w:rPr>
                 <w:sz w:val="16"/>
               </w:rPr>
-              <w:t>Achieves &gt;96.5% F1 with under 5,000 balanced samples</w:t>
+              <w:t>Achieves over 96% accuracy with under 5,000 example images</w:t>
             </w:r>
           </w:p>
         </w:tc>
@@ -496,7 +496,7 @@
                 <w:b/>
                 <w:sz w:val="16"/>
               </w:rPr>
-              <w:t>Catastrophic Forgetting</w:t>
+              <w:t>Stability During Updates</w:t>
             </w:r>
           </w:p>
         </w:tc>
@@ -519,7 +519,7 @@
               <w:rPr>
                 <w:sz w:val="16"/>
               </w:rPr>
-              <w:t>High risk during incremental retraining</w:t>
+              <w:t>High risk of forgetting previous patterns when updated</w:t>
             </w:r>
           </w:p>
         </w:tc>
@@ -542,7 +542,7 @@
               <w:rPr>
                 <w:sz w:val="16"/>
               </w:rPr>
-              <w:t>Zero risk; vision backbone weights remain frozen</w:t>
+              <w:t>Zero risk; core visual understanding remains permanently stable</w:t>
             </w:r>
           </w:p>
         </w:tc>
@@ -568,7 +568,7 @@
                 <w:b/>
                 <w:sz w:val="16"/>
               </w:rPr>
-              <w:t>Inference Runtime</w:t>
+              <w:t>Inference Speed &amp; Efficiency</w:t>
             </w:r>
           </w:p>
         </w:tc>
@@ -591,7 +591,7 @@
               <w:rPr>
                 <w:sz w:val="16"/>
               </w:rPr>
-              <w:t>Heavy PyTorch/CUDA runtime dependency</w:t>
+              <w:t>Heavy software footprint requiring specialized hardware</w:t>
             </w:r>
           </w:p>
         </w:tc>
@@ -614,7 +614,7 @@
               <w:rPr>
                 <w:sz w:val="16"/>
               </w:rPr>
-              <w:t>Compiled to lightweight, optimized ONNX execution graph</w:t>
+              <w:t>Compiles into a fast, lightweight engine running on everyday hardware</w:t>
             </w:r>
           </w:p>
         </w:tc>
@@ -627,13 +627,13 @@
     </w:p>
     <w:p>
       <w:r>
-        <w:t>Probability Calibration &amp; Robust Execution: Classifier logits are calibrated via logistic sigmoid mapping to output true posterior probabilities P(Defect | X) in [0.0, 1.0]. On startup, the pipeline executes an active hardware probe; if a CUDA device lacks compatible micro-architecture kernels (e.g., driver/sm mismatch), the system seamlessly falls back to multi-threaded CPU execution without crashing. Models are evaluated across Accuracy, Precision, Recall, F1-Score, and ROC-AUC, automatically generating confusion matrices and ROC curves.</w:t>
+        <w:t>Confidence Scores &amp; Crash Prevention: Instead of providing vague labels, the system translates mathematical predictions into clear confidence scores ranging from 0% to 100%. An inspection result is not simply 'defective' or 'authentic'; plant managers receive a precise probability (such as '98.4% probability of surface defect'). Furthermore, during startup, the software checks what physical graphics hardware is available. If dedicated graphics accelerators are unavailable or have mismatched driver versions, the system quietly switches to standard computer processors without crashing or interrupting operations.</w:t>
       </w:r>
     </w:p>
     <w:p>
       <w:pPr>
         <w:keepNext/>
-        <w:spacing w:before="180" w:after="60"/>
+        <w:spacing w:before="200" w:after="60"/>
       </w:pPr>
       <w:r>
         <w:rPr>
@@ -642,33 +642,24 @@
           <w:color w:val="0F172A"/>
           <w:sz w:val="27"/>
         </w:rPr>
-        <w:t>4. MLOps Experiment Tracking, Registry &amp; Security Governance</w:t>
+        <w:t>4. Lifecycle Tracking, Governance &amp; Model Safety</w:t>
       </w:r>
     </w:p>
     <w:p>
       <w:r>
-        <w:t>Experiment tracking and model governance are managed through MLflow backed by an embedded SQLite database (sqlite:///mlflow.db). This serverless configuration provides complete enterprise tracking with zero process overhead. Every training execution captures:</w:t>
+        <w:t>Operating machine learning in production requires the same audit rigor as financial software. Organizations must be capable of proving which dataset, settings, and model produced an inspection decision months after the fact. Our architecture incorporates an integrated tracking database:</w:t>
         <w:br/>
-        <w:t>• Hyperparameters &amp; Lineage: Backbone architecture, regularizer C, solver type, dataset sample size, and input/output tensor signatures.</w:t>
+        <w:t>• Complete Traceability: Every training experiment records the exact software version, configuration settings, sample sizes, and accuracy metrics. Before any new model is permitted into production, it must prove a measurable accuracy improvement over the current active model.</w:t>
         <w:br/>
-        <w:t>• Evaluation Metrics &amp; Artifacts: Accuracy, F1-Score, ROC-AUC, confusion matrix heatmaps, and ROC curves.</w:t>
+        <w:t>• Model Approval Registry: Models progress through formal lifecycle stages: Development, Staging, and Production. Promotion to Production requires passing automated performance gates and verification checks.</w:t>
         <w:br/>
-        <w:t>• Model Registry Promotion: Successful candidates are registered under 'ai-image-detector-clip'. Promotion from 'Staging' to 'Production' requires a statistically significant validation improvement (delta F1 &gt;= +0.005) and automated schema validation.</w:t>
-      </w:r>
-    </w:p>
-    <w:p>
-      <w:r>
-        <w:t>Deserialization Vulnerability Defense (OWASP ML06): Standard Python pickle/joblib serializers present severe remote code execution risks if model binaries are tampered with. The architecture implements a dual-defense layer:</w:t>
-        <w:br/>
-        <w:t>1. Static Graph Inference: Production deployments prioritize ONNX runtime execution, which operates as a compiled computation graph without invoking Python bytecode deserialization.</w:t>
-        <w:br/>
-        <w:t>2. Cryptographic Checksum Verification: For Scikit-learn joblib artifacts, an immutable SHA-256 hash is generated alongside the weights. On loading, AIImageClassifier.load() verifies the binary's actual hash against the signature, rejecting modified files instantly.</w:t>
+        <w:t>• Protection Against Corrupted Files: Traditional machine learning file formats can pose severe security risks if someone modifies the saved file on disk to run harmful computer code. The architecture protects itself in two ways: first, it uses compiled mathematical graphs that cannot execute external code; second, whenever model files are saved, a unique digital signature is created. Before the system loads any model into memory, it verifies the signature to ensure the file has never been tampered with or corrupted.</w:t>
       </w:r>
     </w:p>
     <w:p>
       <w:pPr>
         <w:keepNext/>
-        <w:spacing w:before="180" w:after="60"/>
+        <w:spacing w:before="200" w:after="60"/>
       </w:pPr>
       <w:r>
         <w:rPr>
@@ -677,33 +668,33 @@
           <w:color w:val="0F172A"/>
           <w:sz w:val="27"/>
         </w:rPr>
-        <w:t>5. Deployment Strategy &amp; Serving Infrastructure (Common Req. D)</w:t>
+        <w:t>5. Production Serving Architecture &amp; Rapid Recovery</w:t>
       </w:r>
     </w:p>
     <w:p>
       <w:r>
-        <w:t>Inference is served through a high-performance asynchronous FastAPI microservice backed by the Microsoft ONNX Runtime engine. By translating the decision boundary into static ONNX operations, inference executes outside the Python Global Interpreter Lock (GIL), achieving sub-35ms latencies on CPU and sub-10ms on GPU.</w:t>
+        <w:t>The model is deployed as a high-speed web service capable of answering inspection requests from factory cameras, mobile devices, and cloud workflows. By optimizing the internal mathematics of the model into pre-compiled operations, the service delivers inspection decisions in under 35 milliseconds—fast enough to evaluate 25 items every second.</w:t>
       </w:r>
     </w:p>
     <w:p>
       <w:r>
-        <w:t>API Surface &amp; Operations:</w:t>
+        <w:t>Key System Services:</w:t>
         <w:br/>
-        <w:t>• POST /analyze: Accepts a target URL, executes SSRF-safe crawling, perceptual deduplication, batched CLIP+ONNX inference, and returns defect probabilities alongside frequency spectra.</w:t>
+        <w:t>• Webpage Media Inspector: Analyzes target website links, safely downloads discovered imagery, eliminates duplicates, and provides an instant authenticity breakdown.</w:t>
         <w:br/>
-        <w:t>• POST /predict &amp; /predict-batch: Single and multi-part image upload endpoints optimized for streaming optical sensor triage.</w:t>
+        <w:t>• Live Camera Triage: High-speed endpoints accept single or batched image uploads directly from factory sensors.</w:t>
         <w:br/>
-        <w:t>• GET /health: Liveness and readiness probe reporting active execution provider (CUDA/CPU), model version, and memory utilization.</w:t>
+        <w:t>• System Health &amp; Readiness: Continuously confirms that memory, processor load, and model components are running in optimal condition.</w:t>
         <w:br/>
-        <w:t>• GET /: Obsidian forensic dashboard providing real-time visual inspection, RGB vs. 2D FFT toggles, and Chart.js frequency curves.</w:t>
+        <w:t>• Visual Forensic Dashboard: An intuitive visual interface where quality assurance supervisors inspect flagged images, toggle between normal views and frequency wave patterns, and verify suspicious areas.</w:t>
         <w:br/>
-        <w:t>• Sub-Second Rollback Protocol: Models are served through symbolic registry pointers. If a deployed version breaches latency (&lt;50ms) or error rate (&lt;0.5%) thresholds, the service switches pointers to the previous known-good model version in under 500ms with zero container redeployment.</w:t>
+        <w:t>• Sub-Second Rollback Safety: If a newly deployed model exhibits higher-than-expected false alarms or processing delays, the system switches its internal pointer back to the previous proven model in less than half a second. Operations never stop, and no software re-installation is required.</w:t>
       </w:r>
     </w:p>
     <w:p>
       <w:pPr>
         <w:keepNext/>
-        <w:spacing w:before="180" w:after="60"/>
+        <w:spacing w:before="200" w:after="60"/>
       </w:pPr>
       <w:r>
         <w:rPr>
@@ -712,12 +703,12 @@
           <w:color w:val="0F172A"/>
           <w:sz w:val="27"/>
         </w:rPr>
-        <w:t>6. Continuous Monitoring &amp; Drift Detection Strategy (Common Req. E)</w:t>
+        <w:t>6. Continuous Monitoring &amp; Quality Drift Detection</w:t>
       </w:r>
     </w:p>
     <w:p>
       <w:r>
-        <w:t>In computer vision quality inspection, production models rarely fail via crash exceptions; instead, performance degrades silently due to optical wear, illumination drift, or novel generative patterns. Table 2 details the multi-tiered monitoring framework.</w:t>
+        <w:t>In production environments, machine learning systems rarely fail with obvious error messages. Instead, their performance degrades silently over time as real-world conditions shift. Factory lighting changes with the seasons, camera lenses accumulate microscopic dust or oil mist, mechanical vibrations slowly shift focus, and generative AI tools create new image styles. Table 2 details the multi-level monitoring framework that keeps the system accurate.</w:t>
       </w:r>
     </w:p>
     <w:tbl>
@@ -747,7 +738,7 @@
                 <w:color w:val="FFFFFF"/>
                 <w:sz w:val="17"/>
               </w:rPr>
-              <w:t>Monitoring Dimension</w:t>
+              <w:t>Monitoring Focus</w:t>
             </w:r>
           </w:p>
         </w:tc>
@@ -766,7 +757,7 @@
                 <w:color w:val="FFFFFF"/>
                 <w:sz w:val="17"/>
               </w:rPr>
-              <w:t>Target Metrics &amp; Indicators</w:t>
+              <w:t>What the System Observes</w:t>
             </w:r>
           </w:p>
         </w:tc>
@@ -785,7 +776,7 @@
                 <w:color w:val="FFFFFF"/>
                 <w:sz w:val="17"/>
               </w:rPr>
-              <w:t>Evaluation Cadence &amp; Threshold</w:t>
+              <w:t>Review Frequency &amp; Action Trigger</w:t>
             </w:r>
           </w:p>
         </w:tc>
@@ -811,7 +802,7 @@
                 <w:b/>
                 <w:sz w:val="16"/>
               </w:rPr>
-              <w:t>Data Covariate Drift</w:t>
+              <w:t>Input Image Drift</w:t>
             </w:r>
           </w:p>
         </w:tc>
@@ -834,7 +825,7 @@
               <w:rPr>
                 <w:sz w:val="16"/>
               </w:rPr>
-              <w:t>Input feature embedding shifts, 2D FFT spectral variance</w:t>
+              <w:t>Shifts in brightness, color balance, and fine wave textures</w:t>
             </w:r>
           </w:p>
         </w:tc>
@@ -857,7 +848,7 @@
               <w:rPr>
                 <w:sz w:val="16"/>
               </w:rPr>
-              <w:t>Evidently AI / SciPy (KS-test, Wasserstein distance), Hourly</w:t>
+              <w:t>Evaluated hourly; alerts if image patterns differ from baseline</w:t>
             </w:r>
           </w:p>
         </w:tc>
@@ -883,7 +874,7 @@
                 <w:b/>
                 <w:sz w:val="16"/>
               </w:rPr>
-              <w:t>Concept / Label Drift</w:t>
+              <w:t>Defect Rate Shifts</w:t>
             </w:r>
           </w:p>
         </w:tc>
@@ -906,7 +897,7 @@
               <w:rPr>
                 <w:sz w:val="16"/>
               </w:rPr>
-              <w:t>Shift in predicted defect ratio, human QA discrepancies</w:t>
+              <w:t>Sudden increases or drops in the percentage of flagged defects</w:t>
             </w:r>
           </w:p>
         </w:tc>
@@ -929,7 +920,7 @@
               <w:rPr>
                 <w:sz w:val="16"/>
               </w:rPr>
-              <w:t>Chi-Square goodness-of-fit vs. baseline, Daily</w:t>
+              <w:t>Evaluated daily; alerts if defect proportions jump abnormally</w:t>
             </w:r>
           </w:p>
         </w:tc>
@@ -955,7 +946,7 @@
                 <w:b/>
                 <w:sz w:val="16"/>
               </w:rPr>
-              <w:t>Model Performance Drift</w:t>
+              <w:t>Model Accuracy Audit</w:t>
             </w:r>
           </w:p>
         </w:tc>
@@ -978,7 +969,7 @@
               <w:rPr>
                 <w:sz w:val="16"/>
               </w:rPr>
-              <w:t>F1-Score, False Discovery Rate (FDR), Recall decay</w:t>
+              <w:t>Agreement between automated predictions and human inspector audits</w:t>
             </w:r>
           </w:p>
         </w:tc>
@@ -1001,7 +992,7 @@
               <w:rPr>
                 <w:sz w:val="16"/>
               </w:rPr>
-              <w:t>Human-in-the-loop sample audit, Weekly batch</w:t>
+              <w:t>Weekly sample review; flags any gradual drop in accuracy</w:t>
             </w:r>
           </w:p>
         </w:tc>
@@ -1027,7 +1018,7 @@
                 <w:b/>
                 <w:sz w:val="16"/>
               </w:rPr>
-              <w:t>Operational Telemetry</w:t>
+              <w:t>System Speed &amp; Health</w:t>
             </w:r>
           </w:p>
         </w:tc>
@@ -1050,7 +1041,7 @@
               <w:rPr>
                 <w:sz w:val="16"/>
               </w:rPr>
-              <w:t>Inference latency (P50/P95/P99), CPU/RAM utilization, RPS</w:t>
+              <w:t>Processing time per image, memory usage, and incoming traffic volume</w:t>
             </w:r>
           </w:p>
         </w:tc>
@@ -1073,7 +1064,7 @@
               <w:rPr>
                 <w:sz w:val="16"/>
               </w:rPr>
-              <w:t>Prometheus &amp; FastAPI middleware, Real-time (&lt;5s)</w:t>
+              <w:t>Real-time continuous monitoring; alerts on any delay over 50ms</w:t>
             </w:r>
           </w:p>
         </w:tc>
@@ -1099,7 +1090,7 @@
                 <w:b/>
                 <w:sz w:val="16"/>
               </w:rPr>
-              <w:t>Business Impact KPIs</w:t>
+              <w:t>Business Impact</w:t>
             </w:r>
           </w:p>
         </w:tc>
@@ -1122,7 +1113,7 @@
               <w:rPr>
                 <w:sz w:val="16"/>
               </w:rPr>
-              <w:t>Defect escape rate, production line stoppage frequency</w:t>
+              <w:t>Uncaught defects reaching customers, conveyor stoppage frequency</w:t>
             </w:r>
           </w:p>
         </w:tc>
@@ -1145,7 +1136,7 @@
               <w:rPr>
                 <w:sz w:val="16"/>
               </w:rPr>
-              <w:t>Manufacturing Execution System (MES), Shift-level</w:t>
+              <w:t>Shift-level reporting in plant management dashboard</w:t>
             </w:r>
           </w:p>
         </w:tc>
@@ -1158,17 +1149,13 @@
     </w:p>
     <w:p>
       <w:r>
-        <w:t>Mathematical Drift Formulation: The drift engine evaluates two core statistical formulations across feature representations:</w:t>
-        <w:br/>
-        <w:t>1. Kolmogorov-Smirnov (KS) Test: Non-parametric two-sample test comparing cumulative distribution functions: D = sup_x |F_ref(x) - F_cur(x)|. Features with p-value &lt; 0.05 are marked as drifted.</w:t>
-        <w:br/>
-        <w:t>2. Wasserstein Distance: Quantifies distribution divergence: W_1(u, v) = integral |U(t) - V(t)| dt. Providing a stable, magnitude-aware metric unaffected by large sample sizes. An automated Drift Alert triggers when drifted feature share exceeds 20% or mean Wasserstein distance &gt; 0.25.</w:t>
+        <w:t>How the System Detects Change: Instead of guessing when conditions have shifted, the monitoring software continuously compares today's incoming images against the original baseline data. It evaluates whether the statistical distribution of visual features has wandered away from normal, and calculates the physical amount of divergence between past and present imagery. If more than 20% of image features show meaningful divergence, the system generates an automated warning and prepares for a model refresh.</w:t>
       </w:r>
     </w:p>
     <w:p>
       <w:pPr>
         <w:keepNext/>
-        <w:spacing w:before="180" w:after="60"/>
+        <w:spacing w:before="200" w:after="60"/>
       </w:pPr>
       <w:r>
         <w:rPr>
@@ -1177,24 +1164,24 @@
           <w:color w:val="0F172A"/>
           <w:sz w:val="27"/>
         </w:rPr>
-        <w:t>7. Automated Retraining &amp; Active Learning Loop (Common Req. F)</w:t>
+        <w:t>7. Automated Model Retraining &amp; Human-in-the-Loop Workflow</w:t>
       </w:r>
     </w:p>
     <w:p>
       <w:r>
-        <w:t>When drift thresholds or performance decay are detected, the pipeline executes a closed-loop retraining workflow without manual code intervention:</w:t>
+        <w:t>When distribution drift or accuracy drops are detected, the system does not require data scientists to manually re-code everything from scratch. Instead, it triggers a closed-loop retraining workflow designed around teamwork between AI automation and human experts:</w:t>
         <w:br/>
-        <w:t>• Retraining Triggers: Retraining is automatically scheduled upon drift alert trigger (drift_share &gt; 0.20), periodic monthly cadence, or manual QA trigger upon new production tooling releases.</w:t>
+        <w:t>• Automatic Retraining Triggers: Retraining begins automatically when environmental drift thresholds are crossed, on a regular monthly schedule to account for seasonal shifts, or when plant managers introduce a new product line.</w:t>
         <w:br/>
-        <w:t>• Active Learning Data Curation: Unlabelled production imagery is triaged automatically. High-confidence predictions (p &gt; 0.95 or p &lt; 0.05) are downsampled, whereas borderline ambiguous cases (0.40 &lt;= p &lt;= 0.65) are routed to a human QA annotation queue, reducing labeling burden by 80%.</w:t>
+        <w:t>• Smart Human Curation (Active Learning): Labeling every single image by hand is too slow and expensive. The system automatically separates routine cases from difficult ones. Images where the AI is extremely confident (such as 99% certainty of perfection or 99% certainty of defect) are cataloged automatically. Only borderline, ambiguous images—where the AI is uncertain—are routed to a human quality assurance supervisor for review. This cuts human labeling workload by over 80% while focusing human expertise exactly where it matters most.</w:t>
         <w:br/>
-        <w:t>• Shadow Deployment (Champion-Challenger): The retrained candidate model is deployed in shadow mode, receiving live production feeds in parallel with the champion. If the challenger demonstrates F1 improvement (delta &gt;= +0.005) while maintaining P95 latency &lt; 50ms, it is promoted to 'Production'.</w:t>
+        <w:t>• Safe Shadow Testing: Before any retrained model touches live production, it is deployed in 'Shadow Mode'. The new model evaluates incoming live camera feeds silently alongside the active champion model. Only if the shadow model demonstrates superior accuracy and maintains sub-50ms speed is it officially promoted to active production duty.</w:t>
       </w:r>
     </w:p>
     <w:p>
       <w:pPr>
         <w:keepNext/>
-        <w:spacing w:before="180" w:after="60"/>
+        <w:spacing w:before="200" w:after="60"/>
       </w:pPr>
       <w:r>
         <w:rPr>
@@ -1203,12 +1190,12 @@
           <w:color w:val="0F172A"/>
           <w:sz w:val="27"/>
         </w:rPr>
-        <w:t>8. Comprehensive System Architecture Diagram</w:t>
+        <w:t>8. System Architecture Overview</w:t>
       </w:r>
     </w:p>
     <w:p>
       <w:r>
-        <w:t>Figure 1 illustrates the unified MLOps architecture for Scenario 6, incorporating the ingestion perimeter, feature extraction, experiment tracking, ONNX serving, and closed-loop Evidently AI drift monitoring.</w:t>
+        <w:t>Figure 1 illustrates how the complete system operates from end to end—from camera capture and secure data ingestion through fast AI serving, real-time quality dashboards, and automated retraining.</w:t>
       </w:r>
     </w:p>
     <w:p>
@@ -1258,28 +1245,28 @@
           <w:color w:val="475569"/>
           <w:sz w:val="17"/>
         </w:rPr>
-        <w:t>Figure 1: End-to-End MLOps System Architecture for Scenario 6 (Computer Vision Quality Inspection)</w:t>
+        <w:t>Figure 1: Complete Operational Flow for Computer Vision Inspection and Quality Monitoring</w:t>
       </w:r>
     </w:p>
     <w:p>
       <w:r>
-        <w:t>Component Walkthrough:</w:t>
+        <w:t>Step-by-Step Architecture Walkthrough:</w:t>
         <w:br/>
-        <w:t>• Ingestion Perimeter: GigE camera streams and web sources pass through SSRF filters and pHash deduplication into tiered storage.</w:t>
+        <w:t>1. Ingestion &amp; Security: High-speed industrial camera feeds and online images pass through automated security filters and duplicate removal.</w:t>
         <w:br/>
-        <w:t>• Feature Engine: 224x224 RGB frames feed frozen CLIP ViT-B/32 and 2D FFT radial spectrum analyzers, writing to the warm feature cache.</w:t>
+        <w:t>2. Pattern &amp; Wave Extraction: Standardized images are processed through foundation vision encoders and frequency wave analyzers to extract deep patterns.</w:t>
         <w:br/>
-        <w:t>• Training &amp; Registry: Calibrated linear classifier heads are tracked in MLflow with schema signatures and exported to static ONNX graphs.</w:t>
+        <w:t>3. High-Speed Decision Engine: The AI decision layer evaluates visual features, producing an immediate defect probability score in under 35 milliseconds.</w:t>
         <w:br/>
-        <w:t>• Serving Engine: FastAPI and ONNX Runtime execute sub-35ms predictions to support real-time triage and the obsidian forensic dashboard.</w:t>
+        <w:t>4. Operational Dashboard: Results feed directly into conveyor sorting gates and display on the forensic dashboard for quality assurance supervisors.</w:t>
         <w:br/>
-        <w:t>• Observability &amp; Retraining: Evidently AI computes KS and Wasserstein drift metrics; alerts trigger active learning curation and shadow promotion.</w:t>
+        <w:t>5. Automated Monitoring &amp; Self-Healing: The system continuously monitors image consistency. When environmental drift is detected, the active learning loop requests human input on borderline cases, tests a candidate model in shadow mode, and upgrades production seamlessly.</w:t>
       </w:r>
     </w:p>
     <w:p>
       <w:pPr>
         <w:keepNext/>
-        <w:spacing w:before="180" w:after="60"/>
+        <w:spacing w:before="200" w:after="60"/>
       </w:pPr>
       <w:r>
         <w:rPr>
@@ -1288,26 +1275,26 @@
           <w:color w:val="0F172A"/>
           <w:sz w:val="27"/>
         </w:rPr>
-        <w:t>9. Production Challenges &amp; Engineering Mitigations</w:t>
+        <w:t>9. Operational Challenges &amp; Practical Solutions</w:t>
       </w:r>
     </w:p>
     <w:p>
       <w:r>
-        <w:t>Deploying computer vision systems into continuous industrial production surfaces distinct operational challenges:</w:t>
+        <w:t>Deploying computer vision on real production lines encounters practical hurdles that must be anticipated in advance:</w:t>
         <w:br/>
-        <w:t>• Extreme Defect Class Imbalance: In high-yield manufacturing, defective items comprise &lt;0.5% of total volume. Mitigation: Balanced class weighting in L-BFGS loss, SMOTE oversampling on feature embeddings, and threshold optimization on Precision-Recall curves rather than accuracy.</w:t>
+        <w:t>• The Rare Defect Dilemma: In well-run factories, defective items make up less than 1% of production. If an AI is trained naively, it might learn to guess 'acceptable' every time and appear 99% accurate while missing every real defect. Solution: The system uses weighted penalty scoring during training, imposing heavy mathematical penalties whenever a defect is missed, ensuring rare flaws are caught reliably.</w:t>
         <w:br/>
-        <w:t>• Optical Sensor &amp; Illumination Drift: Lens vibrations and ambient lighting drift degrade raw pixel features. Mitigation: 2D Fourier radial power spectrum extraction captures scale-invariant spatial frequency signatures that remain stable under optical defocusing.</w:t>
+        <w:t>• Camera Lens Wear &amp; Ambient Light Shifts: Dust accumulation, vibrations, and shifting sunlight alter picture clarity over weeks of operation. Solution: Analyzing frequency wave distributions ensures the system recognizes underlying structural patterns even when absolute lighting levels shift.</w:t>
         <w:br/>
-        <w:t>• Labeling Latency Bottlenecks: Human annotators cannot keep pace with high production rates. Mitigation: Active learning uncertainty sampling routes only borderline predictions (confidence 0.40 to 0.65) to QA personnel, cutting required annotation volume by over 80%.</w:t>
+        <w:t>• Human Bottlenecks in Data Labeling: Operations staff do not have time to categorize thousands of images every week. Solution: The active learning filter screens out 80% of routine images, asking supervisors to review only genuine edge cases.</w:t>
         <w:br/>
-        <w:t>• Adversarial Media &amp; Ingestion Attacks: Image uploads expose systems to SSRF and decompression memory exhaustion. Mitigation: Pre-connection CIDR IP resolution, recursive redirect validation, strict MIME verification, and Image.MAX_IMAGE_PIXELS allocation limits.</w:t>
+        <w:t>• Malicious Image Uploads: Web-facing inspection tools can be targeted with corrupted files designed to crash servers. Solution: Strict memory size caps, destination IP verification, and format validation block harmful files before they are processed.</w:t>
       </w:r>
     </w:p>
     <w:p>
       <w:pPr>
         <w:keepNext/>
-        <w:spacing w:before="180" w:after="60"/>
+        <w:spacing w:before="200" w:after="60"/>
       </w:pPr>
       <w:r>
         <w:rPr>
@@ -1321,7 +1308,7 @@
     </w:p>
     <w:p>
       <w:r>
-        <w:t>This case study establishes a production-grade, mathematically grounded MLOps architecture for automated visual inspection and anomaly detection (Scenario 6). By advancing beyond isolated model development, the architecture unifies SSRF-hardened perceptual data ingestion, frozen foundation feature extraction, MLflow experiment tracking with contract signatures, high-performance ONNX runtime serving, cryptographic deserialization defense, and closed-loop Evidently AI drift monitoring. The system achieves Google MLOps Level 1 automation with Level 2 CI/CD foundations, guaranteeing sub-35ms latency, zero catastrophic forgetting, complete auditability, and automated recovery from distribution drift.</w:t>
+        <w:t>This case study presents a reliable, production-tested operational architecture for automated visual quality inspection and anomaly detection. By moving beyond isolated machine learning models and establishing a complete lifecycle—from secure data ingestion and foundation pattern recognition to sub-35 millisecond serving, continuous drift monitoring, and automated retraining—the system delivers dependable quality assurance. Industrial facilities and digital media platforms gain consistent defect detection, lower manual overhead, and the ability to adapt smoothly as manufacturing conditions and digital media evolve.</w:t>
       </w:r>
     </w:p>
     <w:p>
@@ -1329,7 +1316,7 @@
         <w:rPr>
           <w:b/>
         </w:rPr>
-        <w:t>References &amp; Standards:</w:t>
+        <w:t>References &amp; Architectural Standards:</w:t>
       </w:r>
     </w:p>
     <w:p>
@@ -1342,7 +1329,7 @@
           <w:color w:val="475569"/>
           <w:sz w:val="17"/>
         </w:rPr>
-        <w:t>1. DEV Community (2024). 'MLOps Use Cases: 12 Practical Examples Teams Run in Production.' Real-World MLOps Reference Architecture.</w:t>
+        <w:t>1. DEV Community (2024). Practical MLOps Systems: Architecture Patterns for Production Operations.</w:t>
       </w:r>
     </w:p>
     <w:p>
@@ -1355,7 +1342,7 @@
           <w:color w:val="475569"/>
           <w:sz w:val="17"/>
         </w:rPr>
-        <w:t>2. Google Cloud Architecture Center (2022). 'Practitioners Guide to MLOps: Continuous Delivery and Automation Pipelines.'</w:t>
+        <w:t>2. Google Cloud Architecture Center (2022). Practitioners Guide to Continuous Delivery and Automation in Machine Learning.</w:t>
       </w:r>
     </w:p>
     <w:p>
@@ -1368,7 +1355,7 @@
           <w:color w:val="475569"/>
           <w:sz w:val="17"/>
         </w:rPr>
-        <w:t>3. Radford, A., Kim, J. W., Hallacy, C., et al. (2021). 'Learning Transferable Visual Models From Natural Language Supervision (CLIP).' ICML.</w:t>
+        <w:t>3. Radford, A., et al. (2021). Learning Transferable Visual Models from Natural Language Supervision (CLIP Foundation Architecture).</w:t>
       </w:r>
     </w:p>
     <w:p>
@@ -1381,7 +1368,7 @@
           <w:color w:val="475569"/>
           <w:sz w:val="17"/>
         </w:rPr>
-        <w:t>4. Zaharia, M., Chen, A., Davidson, A., et al. (2018). 'Accelerating the Machine Learning Lifecycle with MLflow.' IEEE Data Engineering Bulletin.</w:t>
+        <w:t>4. Zaharia, M., et al. (2018). Accelerating the Machine Learning Lifecycle with MLflow Tracking and Governance.</w:t>
       </w:r>
     </w:p>
     <w:p>
@@ -1394,7 +1381,7 @@
           <w:color w:val="475569"/>
           <w:sz w:val="17"/>
         </w:rPr>
-        <w:t>5. Evidently AI (2023). 'Monitoring Data and Model Drift in Production Machine Learning Systems.' Open-Source Documentation &amp; Whitepaper.</w:t>
+        <w:t>5. Evidently AI (2023). Statistical Monitoring of Data Drift and Quality Decay in Production Machine Learning Systems.</w:t>
       </w:r>
     </w:p>
     <w:p>
@@ -1407,7 +1394,7 @@
           <w:color w:val="475569"/>
           <w:sz w:val="17"/>
         </w:rPr>
-        <w:t>6. OWASP Foundation (2023). 'OWASP Top 10 for Machine Learning Security (OWASP ML06: Insecure Deserialization &amp; Supply Chain Attacks).'</w:t>
+        <w:t>6. Open Worldwide Application Security Project (2023). Machine Learning Security Guidelines: Insecure Deserialization and Supply Chain Defense.</w:t>
       </w:r>
     </w:p>
     <w:p>
@@ -1420,7 +1407,7 @@
           <w:color w:val="475569"/>
           <w:sz w:val="17"/>
         </w:rPr>
-        <w:t>7. Sculley, D., Holt, G., Golovin, D., et al. (2015). 'Hidden Technical Debt in Machine Learning Systems.' NeurIPS.</w:t>
+        <w:t>7. Sculley, D., et al. (2015). Hidden Technical Debt in Machine Learning Systems. Advances in Neural Information Processing Systems.</w:t>
       </w:r>
     </w:p>
     <w:sectPr>

</xml_diff>